<commit_message>
bab-1: add ML paragraph
</commit_message>
<xml_diff>
--- a/SKRIPSI/Ekstraksi fitur mutagen ems.docx
+++ b/SKRIPSI/Ekstraksi fitur mutagen ems.docx
@@ -269,21 +269,7 @@
         <w:rPr>
           <w:rFonts w:cs="Times New Roman"/>
         </w:rPr>
-        <w:t xml:space="preserve">(Reddy &amp; </w:t>
-      </w:r>
-      <w:proofErr w:type="spellStart"/>
-      <w:r>
-        <w:rPr>
-          <w:rFonts w:cs="Times New Roman"/>
-        </w:rPr>
-        <w:t>Pinjari</w:t>
-      </w:r>
-      <w:proofErr w:type="spellEnd"/>
-      <w:r>
-        <w:rPr>
-          <w:rFonts w:cs="Times New Roman"/>
-        </w:rPr>
-        <w:t>, 2023)</w:t>
+        <w:t>(Reddy &amp; Pinjari, 2023)</w:t>
       </w:r>
       <w:r>
         <w:rPr>
@@ -513,23 +499,7 @@
           <w:rFonts w:cs="Times New Roman"/>
           <w:szCs w:val="24"/>
         </w:rPr>
-        <w:t xml:space="preserve">(EFSA Panel on Genetically Modified Organisms (GMO) </w:t>
-      </w:r>
-      <w:proofErr w:type="spellStart"/>
-      <w:r>
-        <w:rPr>
-          <w:rFonts w:cs="Times New Roman"/>
-          <w:szCs w:val="24"/>
-        </w:rPr>
-        <w:t>dkk</w:t>
-      </w:r>
-      <w:proofErr w:type="spellEnd"/>
-      <w:r>
-        <w:rPr>
-          <w:rFonts w:cs="Times New Roman"/>
-          <w:szCs w:val="24"/>
-        </w:rPr>
-        <w:t>., 2021)</w:t>
+        <w:t>(EFSA Panel on Genetically Modified Organisms (GMO) dkk., 2021)</w:t>
       </w:r>
       <w:r>
         <w:rPr>
@@ -592,23 +562,7 @@
           <w:rFonts w:cs="Times New Roman"/>
           <w:szCs w:val="24"/>
         </w:rPr>
-        <w:t xml:space="preserve">(EFSA Panel on Genetically Modified Organisms (GMO) </w:t>
-      </w:r>
-      <w:proofErr w:type="spellStart"/>
-      <w:r>
-        <w:rPr>
-          <w:rFonts w:cs="Times New Roman"/>
-          <w:szCs w:val="24"/>
-        </w:rPr>
-        <w:t>dkk</w:t>
-      </w:r>
-      <w:proofErr w:type="spellEnd"/>
-      <w:r>
-        <w:rPr>
-          <w:rFonts w:cs="Times New Roman"/>
-          <w:szCs w:val="24"/>
-        </w:rPr>
-        <w:t>., 2021)</w:t>
+        <w:t>(EFSA Panel on Genetically Modified Organisms (GMO) dkk., 2021)</w:t>
       </w:r>
       <w:r>
         <w:rPr>
@@ -634,6 +588,269 @@
           <w:lang w:val="en-ID"/>
         </w:rPr>
       </w:pPr>
+      <w:r>
+        <w:rPr>
+          <w:noProof/>
+          <w:lang w:val="en-ID"/>
+        </w:rPr>
+        <w:t xml:space="preserve">Seiring maraknya penggunaan EMS dalam mutagenesis berbagai spesies tanaman dan penelitian bioteknologi, hal ini berbanding lurus dengan jumlah publikasi kajian ilmiah yang </w:t>
+      </w:r>
+      <w:r>
+        <w:rPr>
+          <w:noProof/>
+          <w:lang w:val="en-ID"/>
+        </w:rPr>
+        <w:lastRenderedPageBreak/>
+        <w:t xml:space="preserve">semaking meningkat. Fenomena ini merupakan sebuah </w:t>
+      </w:r>
+      <w:r>
+        <w:rPr>
+          <w:noProof/>
+          <w:lang w:val="en-ID"/>
+        </w:rPr>
+        <w:t xml:space="preserve">bagian dari ledakan literatur ilmiah. Menurut data yang dirilis </w:t>
+      </w:r>
+      <w:r>
+        <w:rPr>
+          <w:noProof/>
+          <w:lang w:val="en-ID"/>
+        </w:rPr>
+        <w:fldChar w:fldCharType="begin"/>
+      </w:r>
+      <w:r>
+        <w:rPr>
+          <w:noProof/>
+          <w:lang w:val="en-ID"/>
+        </w:rPr>
+        <w:instrText xml:space="preserve"> ADDIN ZOTERO_ITEM CSL_CITATION {"citationID":"Y0EgJTQD","properties":{"formattedCitation":"(Gonz\\uc0\\u225{}lez-M\\uc0\\u225{}rquez dkk., 2024)","plainCitation":"(González-Márquez dkk., 2024)","noteIndex":0},"citationItems":[{"id":55,"uris":["http://zotero.org/users/local/z1Fhum2z/items/4HMGGL48"],"itemData":{"id":55,"type":"article-journal","abstract":"The number of publications in biomedicine and life sciences has grown so much that it is difﬁcult to keep track of new scientiﬁc works and to have an overview of the evolution of the ﬁeld as a whole. Here, we present a two-dimensional (2D) map of the entire corpus of biomedical literature, based on the abstract texts of 21 million English articles from the PubMed database. To embed the abstracts into 2D, we used the large language model PubMedBERT, combined with t-SNE tailored to handle samples of this size. We used our map to study the emergence of the COVID-19 literature, the evolution of the neuroscience discipline, the uptake of machine learning, the distribution of gender imbalance in academic authorship, and the distribution of retracted paper mill articles. Furthermore, we present an interactive website that allows easy exploration and will enable further insights and facilitate future research.","container-title":"Patterns","DOI":"10.1016/j.patter.2024.100968","ISSN":"2666-3899","issue":"6","language":"en","license":"https://www.elsevier.com/tdm/userlicense/1.0/","note":"publisher: Elsevier BV","page":"100968","source":"Crossref","title":"The landscape of biomedical research","volume":"5","author":[{"family":"González-Márquez","given":"Rita"},{"family":"Schmidt","given":"Luca"},{"family":"Schmidt","given":"Benjamin M."},{"family":"Berens","given":"Philipp"},{"family":"Kobak","given":"Dmitry"}],"issued":{"date-parts":[["2024",6]]}}}],"schema":"https://github.com/citation-style-language/schema/raw/master/csl-citation.json"} </w:instrText>
+      </w:r>
+      <w:r>
+        <w:rPr>
+          <w:noProof/>
+          <w:lang w:val="en-ID"/>
+        </w:rPr>
+        <w:fldChar w:fldCharType="separate"/>
+      </w:r>
+      <w:r>
+        <w:rPr>
+          <w:rFonts w:cs="Times New Roman"/>
+          <w:szCs w:val="24"/>
+        </w:rPr>
+        <w:t>(González-</w:t>
+      </w:r>
+      <w:proofErr w:type="spellStart"/>
+      <w:r>
+        <w:rPr>
+          <w:rFonts w:cs="Times New Roman"/>
+          <w:szCs w:val="24"/>
+        </w:rPr>
+        <w:t>Márquez</w:t>
+      </w:r>
+      <w:proofErr w:type="spellEnd"/>
+      <w:r>
+        <w:rPr>
+          <w:rFonts w:cs="Times New Roman"/>
+          <w:szCs w:val="24"/>
+        </w:rPr>
+        <w:t xml:space="preserve"> </w:t>
+      </w:r>
+      <w:proofErr w:type="spellStart"/>
+      <w:r>
+        <w:rPr>
+          <w:rFonts w:cs="Times New Roman"/>
+          <w:szCs w:val="24"/>
+        </w:rPr>
+        <w:t>dkk</w:t>
+      </w:r>
+      <w:proofErr w:type="spellEnd"/>
+      <w:r>
+        <w:rPr>
+          <w:rFonts w:cs="Times New Roman"/>
+          <w:szCs w:val="24"/>
+        </w:rPr>
+        <w:t>., 2024)</w:t>
+      </w:r>
+      <w:r>
+        <w:rPr>
+          <w:noProof/>
+          <w:lang w:val="en-ID"/>
+        </w:rPr>
+        <w:fldChar w:fldCharType="end"/>
+      </w:r>
+      <w:r>
+        <w:rPr>
+          <w:noProof/>
+          <w:lang w:val="en-ID"/>
+        </w:rPr>
+        <w:t xml:space="preserve">, sekitar 1,5 juta literatur ilmiah di bidang hayati dan biomedis yang dirilis pada salah satu website database literatur ilmiah terbesar di dunia, PubMed. Laju pertumbuhan publikasi yang meledak dengan pesat ini dalam beberapa tahun terakhir ini mengakibatkan peneliti mengalami kesulitan dalam pencarian informasi serta memantau perkembangan ilmu secara spesifik </w:t>
+      </w:r>
+      <w:r>
+        <w:rPr>
+          <w:noProof/>
+          <w:lang w:val="en-ID"/>
+        </w:rPr>
+        <w:fldChar w:fldCharType="begin"/>
+      </w:r>
+      <w:r>
+        <w:rPr>
+          <w:noProof/>
+          <w:lang w:val="en-ID"/>
+        </w:rPr>
+        <w:instrText xml:space="preserve"> ADDIN ZOTERO_ITEM CSL_CITATION {"citationID":"KbR4oaEm","properties":{"formattedCitation":"(Gonz\\uc0\\u225{}lez-M\\uc0\\u225{}rquez dkk., 2024)","plainCitation":"(González-Márquez dkk., 2024)","noteIndex":0},"citationItems":[{"id":55,"uris":["http://zotero.org/users/local/z1Fhum2z/items/4HMGGL48"],"itemData":{"id":55,"type":"article-journal","abstract":"The number of publications in biomedicine and life sciences has grown so much that it is difﬁcult to keep track of new scientiﬁc works and to have an overview of the evolution of the ﬁeld as a whole. Here, we present a two-dimensional (2D) map of the entire corpus of biomedical literature, based on the abstract texts of 21 million English articles from the PubMed database. To embed the abstracts into 2D, we used the large language model PubMedBERT, combined with t-SNE tailored to handle samples of this size. We used our map to study the emergence of the COVID-19 literature, the evolution of the neuroscience discipline, the uptake of machine learning, the distribution of gender imbalance in academic authorship, and the distribution of retracted paper mill articles. Furthermore, we present an interactive website that allows easy exploration and will enable further insights and facilitate future research.","container-title":"Patterns","DOI":"10.1016/j.patter.2024.100968","ISSN":"2666-3899","issue":"6","language":"en","license":"https://www.elsevier.com/tdm/userlicense/1.0/","note":"publisher: Elsevier BV","page":"100968","source":"Crossref","title":"The landscape of biomedical research","volume":"5","author":[{"family":"González-Márquez","given":"Rita"},{"family":"Schmidt","given":"Luca"},{"family":"Schmidt","given":"Benjamin M."},{"family":"Berens","given":"Philipp"},{"family":"Kobak","given":"Dmitry"}],"issued":{"date-parts":[["2024",6]]}}}],"schema":"https://github.com/citation-style-language/schema/raw/master/csl-citation.json"} </w:instrText>
+      </w:r>
+      <w:r>
+        <w:rPr>
+          <w:noProof/>
+          <w:lang w:val="en-ID"/>
+        </w:rPr>
+        <w:fldChar w:fldCharType="separate"/>
+      </w:r>
+      <w:r>
+        <w:rPr>
+          <w:rFonts w:cs="Times New Roman"/>
+          <w:szCs w:val="24"/>
+        </w:rPr>
+        <w:t>(González-</w:t>
+      </w:r>
+      <w:proofErr w:type="spellStart"/>
+      <w:r>
+        <w:rPr>
+          <w:rFonts w:cs="Times New Roman"/>
+          <w:szCs w:val="24"/>
+        </w:rPr>
+        <w:t>Márquez</w:t>
+      </w:r>
+      <w:proofErr w:type="spellEnd"/>
+      <w:r>
+        <w:rPr>
+          <w:rFonts w:cs="Times New Roman"/>
+          <w:szCs w:val="24"/>
+        </w:rPr>
+        <w:t xml:space="preserve"> </w:t>
+      </w:r>
+      <w:proofErr w:type="spellStart"/>
+      <w:r>
+        <w:rPr>
+          <w:rFonts w:cs="Times New Roman"/>
+          <w:szCs w:val="24"/>
+        </w:rPr>
+        <w:t>dkk</w:t>
+      </w:r>
+      <w:proofErr w:type="spellEnd"/>
+      <w:r>
+        <w:rPr>
+          <w:rFonts w:cs="Times New Roman"/>
+          <w:szCs w:val="24"/>
+        </w:rPr>
+        <w:t>., 2024)</w:t>
+      </w:r>
+      <w:r>
+        <w:rPr>
+          <w:noProof/>
+          <w:lang w:val="en-ID"/>
+        </w:rPr>
+        <w:fldChar w:fldCharType="end"/>
+      </w:r>
+      <w:r>
+        <w:rPr>
+          <w:noProof/>
+          <w:lang w:val="en-ID"/>
+        </w:rPr>
+        <w:t xml:space="preserve">. Hal ini tentu saja akan berpengaruh dalam pencarian informasi mengenai mutagenesis EMS, </w:t>
+      </w:r>
+      <w:r>
+        <w:rPr>
+          <w:noProof/>
+          <w:lang w:val="en-ID"/>
+        </w:rPr>
+        <w:t>dikarenakan banyaknya sumber, artikel, dan literatur ilmiah lainnya yang membahas tentang konteks ini. Akibatnya mencari data hasil dari penelitian-penelitian terdahulu merupakan sebuah tantangan tersendiri. Salah satu cara yang dapat dilakukan dalam pencarian data hasil penelitian tersebut adalah dengan melakukan teknik cherry picking dari literatur ilmiah yang tersebar di internet, namun cara tersebut akan memakan waktu yang cukup banyak. Terdapat  cara lain dalam menghadapi tantangan tersebut adalah dengan penerapan machine learning untuk pencarian informasi.</w:t>
+      </w:r>
+    </w:p>
+    <w:p>
+      <w:pPr>
+        <w:ind w:left="147" w:right="142" w:firstLine="420"/>
+        <w:jc w:val="both"/>
+        <w:rPr>
+          <w:noProof/>
+          <w:lang w:val="en-ID"/>
+        </w:rPr>
+      </w:pPr>
+      <w:r>
+        <w:rPr>
+          <w:noProof/>
+          <w:lang w:val="en-ID"/>
+        </w:rPr>
+        <w:t xml:space="preserve">Machine Learning (ML) merupakan suatu bidang dalam pemrograman serta cabang dari pengembangan Artificial Intelegence (AI) yang memungkinkan mesin belajar dalam pembuatan prediksi ataupun pengambilan keputusan berdasarkan data yang disediakan tanpa perlu diprogram secara eksplisit. </w:t>
+      </w:r>
+      <w:r>
+        <w:rPr>
+          <w:noProof/>
+          <w:lang w:val="en-ID"/>
+        </w:rPr>
+        <w:t xml:space="preserve">Pada penerapan ML, model yang dibuat dari berbagai metode ML </w:t>
+      </w:r>
+      <w:r>
+        <w:rPr>
+          <w:noProof/>
+          <w:lang w:val="en-ID"/>
+        </w:rPr>
+        <w:t xml:space="preserve">diprogram untuk menghasilkan sebuah algoritma berdasarkan model matematis dari data yang sebelumnya telah disediakan </w:t>
+      </w:r>
+      <w:r>
+        <w:rPr>
+          <w:noProof/>
+          <w:lang w:val="en-ID"/>
+        </w:rPr>
+        <w:fldChar w:fldCharType="begin"/>
+      </w:r>
+      <w:r>
+        <w:rPr>
+          <w:noProof/>
+          <w:lang w:val="en-ID"/>
+        </w:rPr>
+        <w:instrText xml:space="preserve"> ADDIN ZOTERO_ITEM CSL_CITATION {"citationID":"J8Q7HwBs","properties":{"formattedCitation":"(Shaveta, 2023)","plainCitation":"(Shaveta, 2023)","noteIndex":0},"citationItems":[{"id":61,"uris":["http://zotero.org/users/local/z1Fhum2z/items/T4H2JSF8"],"itemData":{"id":61,"type":"article-journal","abstract":"Machine learning is a particular branch of artificial intelligence that teaches a machine how to learn, whereas artificial intelligence (AI) is the general science that aims to emulate human abilities. An AI method called machine learning teaches computers to learn from their past experiences. Machine learning algorithms don't rely on a predetermined equation as a model, but instead \"learn\" information directly from data using computational techniques. As the quantity of learning examples increases, the algorithms adaptively get better at what they do. This paper provides an overview of the field as well as a variety of machine learning approaches, including supervised, unsupervised, and reinforcement learning and various languages used for machine learning.","container-title":"International Journal of Science and Research Archive","DOI":"10.30574/ijsra.2023.9.1.0410","ISSN":"2582-8185","issue":"1","journalAbbreviation":"Int. J. Sci. Res. Arch.","language":"en","note":"publisher: GSC Online Press","page":"281-285","source":"Crossref","title":"A review on machine learning","volume":"9","author":[{"literal":"Shaveta"}],"issued":{"date-parts":[["2023",5,30]]}}}],"schema":"https://github.com/citation-style-language/schema/raw/master/csl-citation.json"} </w:instrText>
+      </w:r>
+      <w:r>
+        <w:rPr>
+          <w:noProof/>
+          <w:lang w:val="en-ID"/>
+        </w:rPr>
+        <w:fldChar w:fldCharType="separate"/>
+      </w:r>
+      <w:r>
+        <w:rPr>
+          <w:rFonts w:cs="Times New Roman"/>
+        </w:rPr>
+        <w:t>(</w:t>
+      </w:r>
+      <w:proofErr w:type="spellStart"/>
+      <w:r>
+        <w:rPr>
+          <w:rFonts w:cs="Times New Roman"/>
+        </w:rPr>
+        <w:t>Shaveta</w:t>
+      </w:r>
+      <w:proofErr w:type="spellEnd"/>
+      <w:r>
+        <w:rPr>
+          <w:rFonts w:cs="Times New Roman"/>
+        </w:rPr>
+        <w:t>, 2023)</w:t>
+      </w:r>
+      <w:r>
+        <w:rPr>
+          <w:noProof/>
+          <w:lang w:val="en-ID"/>
+        </w:rPr>
+        <w:fldChar w:fldCharType="end"/>
+      </w:r>
+      <w:r>
+        <w:rPr>
+          <w:noProof/>
+          <w:lang w:val="en-ID"/>
+        </w:rPr>
+        <w:t xml:space="preserve">. Pada pengembangan model ML, terdapat 3 jenis pengembangan yang umum digunakan, pengembangan dengan data yang sudah memiliki label (Supervised Learning), pengembangan dengan data tanpa label (Unsupervised Learning), dan juga gabungan dari kedua jenis pengembangan tersebut (Reinforcement Learning). </w:t>
+      </w:r>
       <w:bookmarkStart w:id="0" w:name="_GoBack"/>
       <w:bookmarkEnd w:id="0"/>
     </w:p>
@@ -655,7 +872,6 @@
           <w:noProof/>
           <w:lang w:val="id-ID"/>
         </w:rPr>
-        <w:lastRenderedPageBreak/>
         <w:t>Rumusan Masalah</w:t>
       </w:r>
     </w:p>
@@ -1327,23 +1543,87 @@
           <w:rFonts w:cs="Times New Roman"/>
           <w:szCs w:val="24"/>
         </w:rPr>
-        <w:t xml:space="preserve">Lestari, E. G. (2021). </w:t>
-      </w:r>
-      <w:r>
-        <w:rPr>
-          <w:rFonts w:cs="Times New Roman"/>
-          <w:i/>
-          <w:iCs/>
-          <w:szCs w:val="24"/>
-        </w:rPr>
-        <w:t>APLIKASI INDUKSI MUTASI UNTUK PEMULIAAN TANAMAN HIAS</w:t>
-      </w:r>
-      <w:r>
-        <w:rPr>
-          <w:rFonts w:cs="Times New Roman"/>
-          <w:szCs w:val="24"/>
-        </w:rPr>
-        <w:t>.</w:t>
+        <w:t>González-</w:t>
+      </w:r>
+      <w:proofErr w:type="spellStart"/>
+      <w:r>
+        <w:rPr>
+          <w:rFonts w:cs="Times New Roman"/>
+          <w:szCs w:val="24"/>
+        </w:rPr>
+        <w:t>Márquez</w:t>
+      </w:r>
+      <w:proofErr w:type="spellEnd"/>
+      <w:r>
+        <w:rPr>
+          <w:rFonts w:cs="Times New Roman"/>
+          <w:szCs w:val="24"/>
+        </w:rPr>
+        <w:t xml:space="preserve">, R., Schmidt, L., Schmidt, B. M., </w:t>
+      </w:r>
+      <w:proofErr w:type="spellStart"/>
+      <w:r>
+        <w:rPr>
+          <w:rFonts w:cs="Times New Roman"/>
+          <w:szCs w:val="24"/>
+        </w:rPr>
+        <w:t>Berens</w:t>
+      </w:r>
+      <w:proofErr w:type="spellEnd"/>
+      <w:r>
+        <w:rPr>
+          <w:rFonts w:cs="Times New Roman"/>
+          <w:szCs w:val="24"/>
+        </w:rPr>
+        <w:t xml:space="preserve">, P., &amp; </w:t>
+      </w:r>
+      <w:proofErr w:type="spellStart"/>
+      <w:r>
+        <w:rPr>
+          <w:rFonts w:cs="Times New Roman"/>
+          <w:szCs w:val="24"/>
+        </w:rPr>
+        <w:t>Kobak</w:t>
+      </w:r>
+      <w:proofErr w:type="spellEnd"/>
+      <w:r>
+        <w:rPr>
+          <w:rFonts w:cs="Times New Roman"/>
+          <w:szCs w:val="24"/>
+        </w:rPr>
+        <w:t xml:space="preserve">, D. (2024). The landscape of biomedical research. </w:t>
+      </w:r>
+      <w:r>
+        <w:rPr>
+          <w:rFonts w:cs="Times New Roman"/>
+          <w:i/>
+          <w:iCs/>
+          <w:szCs w:val="24"/>
+        </w:rPr>
+        <w:t>Patterns</w:t>
+      </w:r>
+      <w:r>
+        <w:rPr>
+          <w:rFonts w:cs="Times New Roman"/>
+          <w:szCs w:val="24"/>
+        </w:rPr>
+        <w:t xml:space="preserve">, </w:t>
+      </w:r>
+      <w:r>
+        <w:rPr>
+          <w:rFonts w:cs="Times New Roman"/>
+          <w:i/>
+          <w:iCs/>
+          <w:szCs w:val="24"/>
+        </w:rPr>
+        <w:t>5</w:t>
+      </w:r>
+      <w:r>
+        <w:rPr>
+          <w:rFonts w:cs="Times New Roman"/>
+          <w:szCs w:val="24"/>
+        </w:rPr>
+        <w:t>(6), 100968. https://doi.org/10.1016/j.patter.2024.100968</w:t>
       </w:r>
     </w:p>
     <w:p>
@@ -1354,247 +1634,28 @@
           <w:szCs w:val="24"/>
         </w:rPr>
       </w:pPr>
-      <w:proofErr w:type="spellStart"/>
-      <w:r>
-        <w:rPr>
-          <w:rFonts w:cs="Times New Roman"/>
-          <w:szCs w:val="24"/>
-        </w:rPr>
-        <w:t>Putri</w:t>
-      </w:r>
-      <w:proofErr w:type="spellEnd"/>
-      <w:r>
-        <w:rPr>
-          <w:rFonts w:cs="Times New Roman"/>
-          <w:szCs w:val="24"/>
-        </w:rPr>
-        <w:t xml:space="preserve">, E. E., </w:t>
-      </w:r>
-      <w:proofErr w:type="spellStart"/>
-      <w:r>
-        <w:rPr>
-          <w:rFonts w:cs="Times New Roman"/>
-          <w:szCs w:val="24"/>
-        </w:rPr>
-        <w:t>Pasangka</w:t>
-      </w:r>
-      <w:proofErr w:type="spellEnd"/>
-      <w:r>
-        <w:rPr>
-          <w:rFonts w:cs="Times New Roman"/>
-          <w:szCs w:val="24"/>
-        </w:rPr>
-        <w:t xml:space="preserve">, B., &amp; </w:t>
-      </w:r>
-      <w:proofErr w:type="spellStart"/>
-      <w:r>
-        <w:rPr>
-          <w:rFonts w:cs="Times New Roman"/>
-          <w:szCs w:val="24"/>
-        </w:rPr>
-        <w:t>Louk</w:t>
-      </w:r>
-      <w:proofErr w:type="spellEnd"/>
-      <w:r>
-        <w:rPr>
-          <w:rFonts w:cs="Times New Roman"/>
-          <w:szCs w:val="24"/>
-        </w:rPr>
-        <w:t xml:space="preserve">, A. C. (2024). </w:t>
-      </w:r>
-      <w:proofErr w:type="spellStart"/>
-      <w:r>
-        <w:rPr>
-          <w:rFonts w:cs="Times New Roman"/>
-          <w:i/>
-          <w:iCs/>
-          <w:szCs w:val="24"/>
-        </w:rPr>
-        <w:t>Pemuliaan</w:t>
-      </w:r>
-      <w:proofErr w:type="spellEnd"/>
-      <w:r>
-        <w:rPr>
-          <w:rFonts w:cs="Times New Roman"/>
-          <w:i/>
-          <w:iCs/>
-          <w:szCs w:val="24"/>
-        </w:rPr>
-        <w:t xml:space="preserve"> </w:t>
-      </w:r>
-      <w:proofErr w:type="spellStart"/>
-      <w:r>
-        <w:rPr>
-          <w:rFonts w:cs="Times New Roman"/>
-          <w:i/>
-          <w:iCs/>
-          <w:szCs w:val="24"/>
-        </w:rPr>
-        <w:t>Tanaman</w:t>
-      </w:r>
-      <w:proofErr w:type="spellEnd"/>
-      <w:r>
-        <w:rPr>
-          <w:rFonts w:cs="Times New Roman"/>
-          <w:i/>
-          <w:iCs/>
-          <w:szCs w:val="24"/>
-        </w:rPr>
-        <w:t xml:space="preserve"> </w:t>
-      </w:r>
-      <w:proofErr w:type="spellStart"/>
-      <w:r>
-        <w:rPr>
-          <w:rFonts w:cs="Times New Roman"/>
-          <w:i/>
-          <w:iCs/>
-          <w:szCs w:val="24"/>
-        </w:rPr>
-        <w:t>Bayam</w:t>
-      </w:r>
-      <w:proofErr w:type="spellEnd"/>
-      <w:r>
-        <w:rPr>
-          <w:rFonts w:cs="Times New Roman"/>
-          <w:i/>
-          <w:iCs/>
-          <w:szCs w:val="24"/>
-        </w:rPr>
-        <w:t xml:space="preserve"> </w:t>
-      </w:r>
-      <w:proofErr w:type="spellStart"/>
-      <w:r>
-        <w:rPr>
-          <w:rFonts w:cs="Times New Roman"/>
-          <w:i/>
-          <w:iCs/>
-          <w:szCs w:val="24"/>
-        </w:rPr>
-        <w:t>Lokal</w:t>
-      </w:r>
-      <w:proofErr w:type="spellEnd"/>
-      <w:r>
-        <w:rPr>
-          <w:rFonts w:cs="Times New Roman"/>
-          <w:i/>
-          <w:iCs/>
-          <w:szCs w:val="24"/>
-        </w:rPr>
-        <w:t xml:space="preserve"> Timor </w:t>
-      </w:r>
-      <w:proofErr w:type="spellStart"/>
-      <w:r>
-        <w:rPr>
-          <w:rFonts w:cs="Times New Roman"/>
-          <w:i/>
-          <w:iCs/>
-          <w:szCs w:val="24"/>
-        </w:rPr>
-        <w:t>dengan</w:t>
-      </w:r>
-      <w:proofErr w:type="spellEnd"/>
-      <w:r>
-        <w:rPr>
-          <w:rFonts w:cs="Times New Roman"/>
-          <w:i/>
-          <w:iCs/>
-          <w:szCs w:val="24"/>
-        </w:rPr>
-        <w:t xml:space="preserve"> </w:t>
-      </w:r>
-      <w:proofErr w:type="spellStart"/>
-      <w:r>
-        <w:rPr>
-          <w:rFonts w:cs="Times New Roman"/>
-          <w:i/>
-          <w:iCs/>
-          <w:szCs w:val="24"/>
-        </w:rPr>
-        <w:t>Metode</w:t>
-      </w:r>
-      <w:proofErr w:type="spellEnd"/>
-      <w:r>
-        <w:rPr>
-          <w:rFonts w:cs="Times New Roman"/>
-          <w:i/>
-          <w:iCs/>
-          <w:szCs w:val="24"/>
-        </w:rPr>
-        <w:t xml:space="preserve"> </w:t>
-      </w:r>
-      <w:proofErr w:type="spellStart"/>
-      <w:r>
-        <w:rPr>
-          <w:rFonts w:cs="Times New Roman"/>
-          <w:i/>
-          <w:iCs/>
-          <w:szCs w:val="24"/>
-        </w:rPr>
-        <w:t>Radiasi</w:t>
-      </w:r>
-      <w:proofErr w:type="spellEnd"/>
-      <w:r>
-        <w:rPr>
-          <w:rFonts w:cs="Times New Roman"/>
-          <w:i/>
-          <w:iCs/>
-          <w:szCs w:val="24"/>
-        </w:rPr>
-        <w:t xml:space="preserve"> </w:t>
-      </w:r>
-      <w:proofErr w:type="spellStart"/>
-      <w:r>
-        <w:rPr>
-          <w:rFonts w:cs="Times New Roman"/>
-          <w:i/>
-          <w:iCs/>
-          <w:szCs w:val="24"/>
-        </w:rPr>
-        <w:t>Multigamma</w:t>
-      </w:r>
-      <w:proofErr w:type="spellEnd"/>
-      <w:r>
-        <w:rPr>
-          <w:rFonts w:cs="Times New Roman"/>
-          <w:i/>
-          <w:iCs/>
-          <w:szCs w:val="24"/>
-        </w:rPr>
-        <w:t xml:space="preserve"> </w:t>
-      </w:r>
-      <w:proofErr w:type="spellStart"/>
-      <w:r>
-        <w:rPr>
-          <w:rFonts w:cs="Times New Roman"/>
-          <w:i/>
-          <w:iCs/>
-          <w:szCs w:val="24"/>
-        </w:rPr>
-        <w:t>Standar</w:t>
-      </w:r>
-      <w:proofErr w:type="spellEnd"/>
-      <w:r>
-        <w:rPr>
-          <w:rFonts w:cs="Times New Roman"/>
-          <w:szCs w:val="24"/>
-        </w:rPr>
-        <w:t xml:space="preserve">. </w:t>
-      </w:r>
-      <w:r>
-        <w:rPr>
-          <w:rFonts w:cs="Times New Roman"/>
-          <w:i/>
-          <w:iCs/>
-          <w:szCs w:val="24"/>
-        </w:rPr>
-        <w:t>4</w:t>
-      </w:r>
-      <w:r>
-        <w:rPr>
-          <w:rFonts w:cs="Times New Roman"/>
-          <w:szCs w:val="24"/>
-        </w:rPr>
-        <w:t>(1).</w:t>
+      <w:r>
+        <w:rPr>
+          <w:rFonts w:cs="Times New Roman"/>
+          <w:szCs w:val="24"/>
+        </w:rPr>
+        <w:t xml:space="preserve">Lestari, E. G. (2021). </w:t>
+      </w:r>
+      <w:r>
+        <w:rPr>
+          <w:rFonts w:cs="Times New Roman"/>
+          <w:i/>
+          <w:iCs/>
+          <w:szCs w:val="24"/>
+        </w:rPr>
+        <w:t>APLIKASI INDUKSI MUTASI UNTUK PEMULIAAN TANAMAN HIAS</w:t>
+      </w:r>
+      <w:r>
+        <w:rPr>
+          <w:rFonts w:cs="Times New Roman"/>
+          <w:szCs w:val="24"/>
+        </w:rPr>
+        <w:t>.</w:t>
       </w:r>
     </w:p>
     <w:p>
@@ -1605,6 +1666,257 @@
           <w:szCs w:val="24"/>
         </w:rPr>
       </w:pPr>
+      <w:proofErr w:type="spellStart"/>
+      <w:r>
+        <w:rPr>
+          <w:rFonts w:cs="Times New Roman"/>
+          <w:szCs w:val="24"/>
+        </w:rPr>
+        <w:t>Putri</w:t>
+      </w:r>
+      <w:proofErr w:type="spellEnd"/>
+      <w:r>
+        <w:rPr>
+          <w:rFonts w:cs="Times New Roman"/>
+          <w:szCs w:val="24"/>
+        </w:rPr>
+        <w:t xml:space="preserve">, E. E., </w:t>
+      </w:r>
+      <w:proofErr w:type="spellStart"/>
+      <w:r>
+        <w:rPr>
+          <w:rFonts w:cs="Times New Roman"/>
+          <w:szCs w:val="24"/>
+        </w:rPr>
+        <w:t>Pasangka</w:t>
+      </w:r>
+      <w:proofErr w:type="spellEnd"/>
+      <w:r>
+        <w:rPr>
+          <w:rFonts w:cs="Times New Roman"/>
+          <w:szCs w:val="24"/>
+        </w:rPr>
+        <w:t xml:space="preserve">, B., &amp; </w:t>
+      </w:r>
+      <w:proofErr w:type="spellStart"/>
+      <w:r>
+        <w:rPr>
+          <w:rFonts w:cs="Times New Roman"/>
+          <w:szCs w:val="24"/>
+        </w:rPr>
+        <w:t>Louk</w:t>
+      </w:r>
+      <w:proofErr w:type="spellEnd"/>
+      <w:r>
+        <w:rPr>
+          <w:rFonts w:cs="Times New Roman"/>
+          <w:szCs w:val="24"/>
+        </w:rPr>
+        <w:t xml:space="preserve">, A. C. (2024). </w:t>
+      </w:r>
+      <w:proofErr w:type="spellStart"/>
+      <w:r>
+        <w:rPr>
+          <w:rFonts w:cs="Times New Roman"/>
+          <w:i/>
+          <w:iCs/>
+          <w:szCs w:val="24"/>
+        </w:rPr>
+        <w:t>Pemuliaan</w:t>
+      </w:r>
+      <w:proofErr w:type="spellEnd"/>
+      <w:r>
+        <w:rPr>
+          <w:rFonts w:cs="Times New Roman"/>
+          <w:i/>
+          <w:iCs/>
+          <w:szCs w:val="24"/>
+        </w:rPr>
+        <w:t xml:space="preserve"> </w:t>
+      </w:r>
+      <w:proofErr w:type="spellStart"/>
+      <w:r>
+        <w:rPr>
+          <w:rFonts w:cs="Times New Roman"/>
+          <w:i/>
+          <w:iCs/>
+          <w:szCs w:val="24"/>
+        </w:rPr>
+        <w:t>Tanaman</w:t>
+      </w:r>
+      <w:proofErr w:type="spellEnd"/>
+      <w:r>
+        <w:rPr>
+          <w:rFonts w:cs="Times New Roman"/>
+          <w:i/>
+          <w:iCs/>
+          <w:szCs w:val="24"/>
+        </w:rPr>
+        <w:t xml:space="preserve"> </w:t>
+      </w:r>
+      <w:proofErr w:type="spellStart"/>
+      <w:r>
+        <w:rPr>
+          <w:rFonts w:cs="Times New Roman"/>
+          <w:i/>
+          <w:iCs/>
+          <w:szCs w:val="24"/>
+        </w:rPr>
+        <w:t>Bayam</w:t>
+      </w:r>
+      <w:proofErr w:type="spellEnd"/>
+      <w:r>
+        <w:rPr>
+          <w:rFonts w:cs="Times New Roman"/>
+          <w:i/>
+          <w:iCs/>
+          <w:szCs w:val="24"/>
+        </w:rPr>
+        <w:t xml:space="preserve"> </w:t>
+      </w:r>
+      <w:proofErr w:type="spellStart"/>
+      <w:r>
+        <w:rPr>
+          <w:rFonts w:cs="Times New Roman"/>
+          <w:i/>
+          <w:iCs/>
+          <w:szCs w:val="24"/>
+        </w:rPr>
+        <w:t>Lokal</w:t>
+      </w:r>
+      <w:proofErr w:type="spellEnd"/>
+      <w:r>
+        <w:rPr>
+          <w:rFonts w:cs="Times New Roman"/>
+          <w:i/>
+          <w:iCs/>
+          <w:szCs w:val="24"/>
+        </w:rPr>
+        <w:t xml:space="preserve"> Timor </w:t>
+      </w:r>
+      <w:proofErr w:type="spellStart"/>
+      <w:r>
+        <w:rPr>
+          <w:rFonts w:cs="Times New Roman"/>
+          <w:i/>
+          <w:iCs/>
+          <w:szCs w:val="24"/>
+        </w:rPr>
+        <w:t>dengan</w:t>
+      </w:r>
+      <w:proofErr w:type="spellEnd"/>
+      <w:r>
+        <w:rPr>
+          <w:rFonts w:cs="Times New Roman"/>
+          <w:i/>
+          <w:iCs/>
+          <w:szCs w:val="24"/>
+        </w:rPr>
+        <w:t xml:space="preserve"> </w:t>
+      </w:r>
+      <w:proofErr w:type="spellStart"/>
+      <w:r>
+        <w:rPr>
+          <w:rFonts w:cs="Times New Roman"/>
+          <w:i/>
+          <w:iCs/>
+          <w:szCs w:val="24"/>
+        </w:rPr>
+        <w:t>Metode</w:t>
+      </w:r>
+      <w:proofErr w:type="spellEnd"/>
+      <w:r>
+        <w:rPr>
+          <w:rFonts w:cs="Times New Roman"/>
+          <w:i/>
+          <w:iCs/>
+          <w:szCs w:val="24"/>
+        </w:rPr>
+        <w:t xml:space="preserve"> </w:t>
+      </w:r>
+      <w:proofErr w:type="spellStart"/>
+      <w:r>
+        <w:rPr>
+          <w:rFonts w:cs="Times New Roman"/>
+          <w:i/>
+          <w:iCs/>
+          <w:szCs w:val="24"/>
+        </w:rPr>
+        <w:t>Radiasi</w:t>
+      </w:r>
+      <w:proofErr w:type="spellEnd"/>
+      <w:r>
+        <w:rPr>
+          <w:rFonts w:cs="Times New Roman"/>
+          <w:i/>
+          <w:iCs/>
+          <w:szCs w:val="24"/>
+        </w:rPr>
+        <w:t xml:space="preserve"> </w:t>
+      </w:r>
+      <w:proofErr w:type="spellStart"/>
+      <w:r>
+        <w:rPr>
+          <w:rFonts w:cs="Times New Roman"/>
+          <w:i/>
+          <w:iCs/>
+          <w:szCs w:val="24"/>
+        </w:rPr>
+        <w:t>Multigamma</w:t>
+      </w:r>
+      <w:proofErr w:type="spellEnd"/>
+      <w:r>
+        <w:rPr>
+          <w:rFonts w:cs="Times New Roman"/>
+          <w:i/>
+          <w:iCs/>
+          <w:szCs w:val="24"/>
+        </w:rPr>
+        <w:t xml:space="preserve"> </w:t>
+      </w:r>
+      <w:proofErr w:type="spellStart"/>
+      <w:r>
+        <w:rPr>
+          <w:rFonts w:cs="Times New Roman"/>
+          <w:i/>
+          <w:iCs/>
+          <w:szCs w:val="24"/>
+        </w:rPr>
+        <w:t>Standar</w:t>
+      </w:r>
+      <w:proofErr w:type="spellEnd"/>
+      <w:r>
+        <w:rPr>
+          <w:rFonts w:cs="Times New Roman"/>
+          <w:szCs w:val="24"/>
+        </w:rPr>
+        <w:t xml:space="preserve">. </w:t>
+      </w:r>
+      <w:r>
+        <w:rPr>
+          <w:rFonts w:cs="Times New Roman"/>
+          <w:i/>
+          <w:iCs/>
+          <w:szCs w:val="24"/>
+        </w:rPr>
+        <w:t>4</w:t>
+      </w:r>
+      <w:r>
+        <w:rPr>
+          <w:rFonts w:cs="Times New Roman"/>
+          <w:szCs w:val="24"/>
+        </w:rPr>
+        <w:t>(1).</w:t>
+      </w:r>
+    </w:p>
+    <w:p>
+      <w:pPr>
+        <w:pStyle w:val="Bibliography"/>
+        <w:rPr>
+          <w:rFonts w:cs="Times New Roman"/>
+          <w:szCs w:val="24"/>
+        </w:rPr>
+      </w:pPr>
       <w:r>
         <w:rPr>
           <w:rFonts w:cs="Times New Roman"/>
@@ -1659,6 +1971,64 @@
           <w:szCs w:val="24"/>
         </w:rPr>
         <w:t>(1), 20–29. https://doi.org/10.56557/ajaas/2023/v6i135</w:t>
+      </w:r>
+    </w:p>
+    <w:p>
+      <w:pPr>
+        <w:pStyle w:val="Bibliography"/>
+        <w:rPr>
+          <w:rFonts w:cs="Times New Roman"/>
+          <w:szCs w:val="24"/>
+        </w:rPr>
+      </w:pPr>
+      <w:proofErr w:type="spellStart"/>
+      <w:r>
+        <w:rPr>
+          <w:rFonts w:cs="Times New Roman"/>
+          <w:szCs w:val="24"/>
+        </w:rPr>
+        <w:lastRenderedPageBreak/>
+        <w:t>Shaveta</w:t>
+      </w:r>
+      <w:proofErr w:type="spellEnd"/>
+      <w:r>
+        <w:rPr>
+          <w:rFonts w:cs="Times New Roman"/>
+          <w:szCs w:val="24"/>
+        </w:rPr>
+        <w:t xml:space="preserve">. (2023). A review on machine learning. </w:t>
+      </w:r>
+      <w:r>
+        <w:rPr>
+          <w:rFonts w:cs="Times New Roman"/>
+          <w:i/>
+          <w:iCs/>
+          <w:szCs w:val="24"/>
+        </w:rPr>
+        <w:t>International Journal of Science and Research Archive</w:t>
+      </w:r>
+      <w:r>
+        <w:rPr>
+          <w:rFonts w:cs="Times New Roman"/>
+          <w:szCs w:val="24"/>
+        </w:rPr>
+        <w:t xml:space="preserve">, </w:t>
+      </w:r>
+      <w:r>
+        <w:rPr>
+          <w:rFonts w:cs="Times New Roman"/>
+          <w:i/>
+          <w:iCs/>
+          <w:szCs w:val="24"/>
+        </w:rPr>
+        <w:t>9</w:t>
+      </w:r>
+      <w:r>
+        <w:rPr>
+          <w:rFonts w:cs="Times New Roman"/>
+          <w:szCs w:val="24"/>
+        </w:rPr>
+        <w:t>(1), 281–285. https://doi.org/10.30574/ijsra.2023.9.1.0410</w:t>
       </w:r>
     </w:p>
     <w:p>
@@ -2746,4 +3116,16 @@
     </a:ext>
   </a:extLst>
 </a:theme>
+</file>
+
+<file path=customXml/item1.xml><?xml version="1.0" encoding="utf-8"?>
+<b:Sources xmlns:b="http://schemas.openxmlformats.org/officeDocument/2006/bibliography" xmlns="http://schemas.openxmlformats.org/officeDocument/2006/bibliography" SelectedStyle="\APASixthEditionOfficeOnline.xsl" StyleName="APA" Version="6"/>
+</file>
+
+<file path=customXml/itemProps1.xml><?xml version="1.0" encoding="utf-8"?>
+<ds:datastoreItem xmlns:ds="http://schemas.openxmlformats.org/officeDocument/2006/customXml" ds:itemID="{445EC0FF-74C4-429B-8026-C559D4737213}">
+  <ds:schemaRefs>
+    <ds:schemaRef ds:uri="http://schemas.openxmlformats.org/officeDocument/2006/bibliography"/>
+  </ds:schemaRefs>
+</ds:datastoreItem>
 </file>
</xml_diff>

<commit_message>
bab-1: add BERT & text-mining paragraph
</commit_message>
<xml_diff>
--- a/SKRIPSI/Ekstraksi fitur mutagen ems.docx
+++ b/SKRIPSI/Ekstraksi fitur mutagen ems.docx
@@ -636,39 +636,7 @@
           <w:rFonts w:cs="Times New Roman"/>
           <w:szCs w:val="24"/>
         </w:rPr>
-        <w:t>(González-</w:t>
-      </w:r>
-      <w:proofErr w:type="spellStart"/>
-      <w:r>
-        <w:rPr>
-          <w:rFonts w:cs="Times New Roman"/>
-          <w:szCs w:val="24"/>
-        </w:rPr>
-        <w:t>Márquez</w:t>
-      </w:r>
-      <w:proofErr w:type="spellEnd"/>
-      <w:r>
-        <w:rPr>
-          <w:rFonts w:cs="Times New Roman"/>
-          <w:szCs w:val="24"/>
-        </w:rPr>
-        <w:t xml:space="preserve"> </w:t>
-      </w:r>
-      <w:proofErr w:type="spellStart"/>
-      <w:r>
-        <w:rPr>
-          <w:rFonts w:cs="Times New Roman"/>
-          <w:szCs w:val="24"/>
-        </w:rPr>
-        <w:t>dkk</w:t>
-      </w:r>
-      <w:proofErr w:type="spellEnd"/>
-      <w:r>
-        <w:rPr>
-          <w:rFonts w:cs="Times New Roman"/>
-          <w:szCs w:val="24"/>
-        </w:rPr>
-        <w:t>., 2024)</w:t>
+        <w:t>(González-Márquez dkk., 2024)</w:t>
       </w:r>
       <w:r>
         <w:rPr>
@@ -710,39 +678,7 @@
           <w:rFonts w:cs="Times New Roman"/>
           <w:szCs w:val="24"/>
         </w:rPr>
-        <w:t>(González-</w:t>
-      </w:r>
-      <w:proofErr w:type="spellStart"/>
-      <w:r>
-        <w:rPr>
-          <w:rFonts w:cs="Times New Roman"/>
-          <w:szCs w:val="24"/>
-        </w:rPr>
-        <w:t>Márquez</w:t>
-      </w:r>
-      <w:proofErr w:type="spellEnd"/>
-      <w:r>
-        <w:rPr>
-          <w:rFonts w:cs="Times New Roman"/>
-          <w:szCs w:val="24"/>
-        </w:rPr>
-        <w:t xml:space="preserve"> </w:t>
-      </w:r>
-      <w:proofErr w:type="spellStart"/>
-      <w:r>
-        <w:rPr>
-          <w:rFonts w:cs="Times New Roman"/>
-          <w:szCs w:val="24"/>
-        </w:rPr>
-        <w:t>dkk</w:t>
-      </w:r>
-      <w:proofErr w:type="spellEnd"/>
-      <w:r>
-        <w:rPr>
-          <w:rFonts w:cs="Times New Roman"/>
-          <w:szCs w:val="24"/>
-        </w:rPr>
-        <w:t>., 2024)</w:t>
+        <w:t>(González-Márquez dkk., 2024)</w:t>
       </w:r>
       <w:r>
         <w:rPr>
@@ -763,7 +699,21 @@
           <w:noProof/>
           <w:lang w:val="en-ID"/>
         </w:rPr>
-        <w:t>dikarenakan banyaknya sumber, artikel, dan literatur ilmiah lainnya yang membahas tentang konteks ini. Akibatnya mencari data hasil dari penelitian-penelitian terdahulu merupakan sebuah tantangan tersendiri. Salah satu cara yang dapat dilakukan dalam pencarian data hasil penelitian tersebut adalah dengan melakukan teknik cherry picking dari literatur ilmiah yang tersebar di internet, namun cara tersebut akan memakan waktu yang cukup banyak. Terdapat  cara lain dalam menghadapi tantangan tersebut adalah dengan penerapan machine learning untuk pencarian informasi.</w:t>
+        <w:t>dikarenakan banyaknya sumber, artikel, dan literatur ilmiah lainnya yang membahas tentang konteks ini. Akibatnya mencari data hasil dari penelitian-penelitian terdahulu merupakan sebuah tantangan tersendiri. Salah satu cara yang dapat dilakukan dalam pencarian data hasil penelitian tersebut adalah dengan melakukan teknik cherry picking dari literatur ilmiah yang tersebar di internet, namun cara tersebut akan memakan waktu yang cukup banyak. Terdapat  cara lain dalam menghadapi tantangan tersebut adalah dengan penerapan</w:t>
+      </w:r>
+      <w:r>
+        <w:rPr>
+          <w:noProof/>
+          <w:lang w:val="en-ID"/>
+        </w:rPr>
+        <w:t xml:space="preserve"> text mining </w:t>
+      </w:r>
+      <w:r>
+        <w:rPr>
+          <w:noProof/>
+          <w:lang w:val="en-ID"/>
+        </w:rPr>
+        <w:t>untuk pencarian informasi.</w:t>
       </w:r>
     </w:p>
     <w:p>
@@ -780,6 +730,127 @@
           <w:noProof/>
           <w:lang w:val="en-ID"/>
         </w:rPr>
+        <w:t>Text mining merupakan sebuah proses dalam eksplorasi dan analisa</w:t>
+      </w:r>
+      <w:r>
+        <w:rPr>
+          <w:noProof/>
+          <w:lang w:val="en-ID"/>
+        </w:rPr>
+        <w:t xml:space="preserve"> teks yang diperoleh dari kumpulan dokumen yang bertujuan untuk analisis terhadap hubungan, keterkaitan, dan pengelompokan antar dokumen </w:t>
+      </w:r>
+      <w:r>
+        <w:rPr>
+          <w:noProof/>
+          <w:lang w:val="en-ID"/>
+        </w:rPr>
+        <w:fldChar w:fldCharType="begin"/>
+      </w:r>
+      <w:r>
+        <w:rPr>
+          <w:noProof/>
+          <w:lang w:val="en-ID"/>
+        </w:rPr>
+        <w:instrText xml:space="preserve"> ADDIN ZOTERO_ITEM CSL_CITATION {"citationID":"2cHI02cu","properties":{"formattedCitation":"(Ompo &amp; Pakereng, 2024)","plainCitation":"(Ompo &amp; Pakereng, 2024)","noteIndex":0},"citationItems":[{"id":71,"uris":["http://zotero.org/users/local/z1Fhum2z/items/IAKFCU5A"],"itemData":{"id":71,"type":"article-journal","abstract":"Zalora Indonesia is one of the online retail business people who use Twitter social media as a means to do advertising. The purpose of this study is to determine the type of tweets content that is widely liked and retweeted by Zalora Indonesia followers to advertise to Twitter users. The collection of tweets data is done by integrating the Twitter API and Python programming language. The data analysis method is carried out by utilizing 2 tools, namely the Python programming language for text preprocessing and Rapidminer for data processing using the KMeans algorithm. The results of the application of the K-Means algorithm are 4 clusters, including Zalora cashback (cluster 1), skincare and woman style (cluster 2), payday and shopping time (cluster 3), as well as holiday promos (cluster 4). Based on the calculation of the average number of likes and retweets in each cluster, the type of content with the most likes and retweets was obtained, namely regarding holiday promos (cluster 4). So that business people can take advantage of the like and retweet features as a means for advertising to Zalora Indonesia users.","container-title":"Progresif: Jurnal Ilmiah Komputer","DOI":"10.35889/progresif.v20i1.1576","ISSN":"2685-0877, 0216-3284","issue":"1","journalAbbreviation":"Progresif J. Ilmi. Kom","language":"id","page":"314","source":"DOI.org (Crossref)","title":"Penerapan Text Mining Untuk Advertising Pada Data Tweets Zalora Indonesia Dengan Menggunakan Metode K-Means Clustering","volume":"20","author":[{"family":"Ompo","given":"Feybiola Agustine Andrea"},{"family":"Pakereng","given":"Magdalena A. Ineke"}],"issued":{"date-parts":[["2024",2,16]]}}}],"schema":"https://github.com/citation-style-language/schema/raw/master/csl-citation.json"} </w:instrText>
+      </w:r>
+      <w:r>
+        <w:rPr>
+          <w:noProof/>
+          <w:lang w:val="en-ID"/>
+        </w:rPr>
+        <w:fldChar w:fldCharType="separate"/>
+      </w:r>
+      <w:r>
+        <w:rPr>
+          <w:rFonts w:cs="Times New Roman"/>
+        </w:rPr>
+        <w:t>(</w:t>
+      </w:r>
+      <w:proofErr w:type="spellStart"/>
+      <w:r>
+        <w:rPr>
+          <w:rFonts w:cs="Times New Roman"/>
+        </w:rPr>
+        <w:t>Ompo</w:t>
+      </w:r>
+      <w:proofErr w:type="spellEnd"/>
+      <w:r>
+        <w:rPr>
+          <w:rFonts w:cs="Times New Roman"/>
+        </w:rPr>
+        <w:t xml:space="preserve"> &amp; </w:t>
+      </w:r>
+      <w:proofErr w:type="spellStart"/>
+      <w:r>
+        <w:rPr>
+          <w:rFonts w:cs="Times New Roman"/>
+        </w:rPr>
+        <w:t>Pakereng</w:t>
+      </w:r>
+      <w:proofErr w:type="spellEnd"/>
+      <w:r>
+        <w:rPr>
+          <w:rFonts w:cs="Times New Roman"/>
+        </w:rPr>
+        <w:t>, 2024)</w:t>
+      </w:r>
+      <w:r>
+        <w:rPr>
+          <w:noProof/>
+          <w:lang w:val="en-ID"/>
+        </w:rPr>
+        <w:fldChar w:fldCharType="end"/>
+      </w:r>
+      <w:r>
+        <w:rPr>
+          <w:noProof/>
+          <w:lang w:val="en-ID"/>
+        </w:rPr>
+        <w:t xml:space="preserve">. </w:t>
+      </w:r>
+      <w:r>
+        <w:rPr>
+          <w:noProof/>
+          <w:lang w:val="en-ID"/>
+        </w:rPr>
+        <w:t xml:space="preserve">Pada bidang ilmu komputer dan statistika, data mining menerapkan beberapa model matematis untuk menggali informasi-informasi tersebut. Jika melihat dari konteks meledaknya jumlah publikasi ilmiah, data mining merupakan sebuah terobosan yang akan sangat membantu peneliti dalam pengumpulan data dari hasil penelitian mutagenesis sebelumnya. </w:t>
+      </w:r>
+      <w:r>
+        <w:rPr>
+          <w:noProof/>
+          <w:lang w:val="en-ID"/>
+        </w:rPr>
+        <w:t>U</w:t>
+      </w:r>
+      <w:r>
+        <w:rPr>
+          <w:noProof/>
+          <w:lang w:val="en-ID"/>
+        </w:rPr>
+        <w:t>mumnya</w:t>
+      </w:r>
+      <w:r>
+        <w:rPr>
+          <w:noProof/>
+          <w:lang w:val="en-ID"/>
+        </w:rPr>
+        <w:t xml:space="preserve"> penerapan metode text mining ini akan diselaraskan dengan penerapan Machine Learning (ML).</w:t>
+      </w:r>
+    </w:p>
+    <w:p>
+      <w:pPr>
+        <w:ind w:left="147" w:right="142" w:firstLine="420"/>
+        <w:jc w:val="both"/>
+        <w:rPr>
+          <w:noProof/>
+          <w:lang w:val="en-ID"/>
+        </w:rPr>
+      </w:pPr>
+      <w:r>
+        <w:rPr>
+          <w:noProof/>
+          <w:lang w:val="en-ID"/>
+        </w:rPr>
         <w:t xml:space="preserve">Machine Learning (ML) merupakan suatu bidang dalam pemrograman serta cabang dari pengembangan Artificial Intelegence (AI) yang memungkinkan mesin belajar dalam pembuatan prediksi ataupun pengambilan keputusan berdasarkan data yang disediakan tanpa perlu diprogram secara eksplisit. </w:t>
       </w:r>
       <w:r>
@@ -821,6 +892,154 @@
         <w:rPr>
           <w:rFonts w:cs="Times New Roman"/>
         </w:rPr>
+        <w:t>(Shaveta, 2023)</w:t>
+      </w:r>
+      <w:r>
+        <w:rPr>
+          <w:noProof/>
+          <w:lang w:val="en-ID"/>
+        </w:rPr>
+        <w:fldChar w:fldCharType="end"/>
+      </w:r>
+      <w:r>
+        <w:rPr>
+          <w:noProof/>
+          <w:lang w:val="en-ID"/>
+        </w:rPr>
+        <w:t xml:space="preserve">. Pada pengembangan model ML, terdapat 3 jenis pengembangan yang umum digunakan, pengembangan dengan data yang sudah memiliki label (Supervised Learning), pengembangan dengan data tanpa label (Unsupervised Learning), dan juga gabungan dari kedua jenis pengembangan tersebut (Reinforcement Learning). </w:t>
+      </w:r>
+      <w:r>
+        <w:rPr>
+          <w:noProof/>
+          <w:lang w:val="en-ID"/>
+        </w:rPr>
+        <w:t xml:space="preserve">Dalam penerapa ML selain ketiga jenis pengembangan tersebut, terdapat juga beberapa jenis pengembangan yang lebih spesifik, salah satunya adalah Natural Language Processing (NLP). NLP merupakan sebuah cabang dari pengembangan AI yang </w:t>
+      </w:r>
+      <w:r>
+        <w:rPr>
+          <w:noProof/>
+          <w:lang w:val="en-ID"/>
+        </w:rPr>
+        <w:t>bidang ilmu yang memungkinkan mesin untuk memahami, mengolah, dan menghasilkan teks menggunakan bahasa manusia</w:t>
+      </w:r>
+      <w:r>
+        <w:rPr>
+          <w:noProof/>
+          <w:lang w:val="en-ID"/>
+        </w:rPr>
+        <w:t xml:space="preserve">. </w:t>
+      </w:r>
+      <w:r>
+        <w:rPr>
+          <w:noProof/>
+          <w:lang w:val="en-ID"/>
+        </w:rPr>
+        <w:t xml:space="preserve">Ada berbagai macam metode dan juga model yang lazim digunakan dalam pengembangan NLP, seperti Word2Vec, ELMo, serta BERT </w:t>
+      </w:r>
+      <w:r>
+        <w:rPr>
+          <w:noProof/>
+          <w:lang w:val="en-ID"/>
+        </w:rPr>
+        <w:fldChar w:fldCharType="begin"/>
+      </w:r>
+      <w:r>
+        <w:rPr>
+          <w:noProof/>
+          <w:lang w:val="en-ID"/>
+        </w:rPr>
+        <w:instrText xml:space="preserve"> ADDIN ZOTERO_ITEM CSL_CITATION {"citationID":"Lb9Y2jEF","properties":{"formattedCitation":"(Lee dkk., 2020)","plainCitation":"(Lee dkk., 2020)","noteIndex":0},"citationItems":[{"id":22,"uris":["http://zotero.org/users/local/z1Fhum2z/items/58TKKQQ5"],"itemData":{"id":22,"type":"article-journal","abstract":"Motivation: Biomedical text mining is becoming increasingly important as the number of biomedical documents rapidly grows. With the progress in natural language processing (NLP), extracting valuable information from biomedical literature has gained popularity among researchers, and deep learning has boosted the development of effective biomedical text mining models. However, directly applying the advancements in NLP to biomedical text mining often yields unsatisfactory results due to a word distribution shift from general domain corpora to biomedical corpora. In this article, we investigate how the recently introduced pre-trained language model BERT can be adapted for biomedical corpora.","container-title":"Bioinformatics","DOI":"10.1093/bioinformatics/btz682","ISSN":"1367-4803, 1367-4811","issue":"4","language":"en","license":"http://creativecommons.org/licenses/by/4.0/","page":"1234-1240","source":"DOI.org (Crossref)","title":"BioBERT: a pre-trained biomedical language representation model for biomedical text mining","title-short":"BioBERT","volume":"36","author":[{"family":"Lee","given":"Jinhyuk"},{"family":"Yoon","given":"Wonjin"},{"family":"Kim","given":"Sungdong"},{"family":"Kim","given":"Donghyeon"},{"family":"Kim","given":"Sunkyu"},{"family":"So","given":"Chan Ho"},{"family":"Kang","given":"Jaewoo"}],"editor":[{"family":"Wren","given":"Jonathan"}],"issued":{"date-parts":[["2020",2,15]]}}}],"schema":"https://github.com/citation-style-language/schema/raw/master/csl-citation.json"} </w:instrText>
+      </w:r>
+      <w:r>
+        <w:rPr>
+          <w:noProof/>
+          <w:lang w:val="en-ID"/>
+        </w:rPr>
+        <w:fldChar w:fldCharType="separate"/>
+      </w:r>
+      <w:r>
+        <w:rPr>
+          <w:rFonts w:cs="Times New Roman"/>
+        </w:rPr>
+        <w:t xml:space="preserve">(Lee </w:t>
+      </w:r>
+      <w:proofErr w:type="spellStart"/>
+      <w:r>
+        <w:rPr>
+          <w:rFonts w:cs="Times New Roman"/>
+        </w:rPr>
+        <w:t>dkk</w:t>
+      </w:r>
+      <w:proofErr w:type="spellEnd"/>
+      <w:r>
+        <w:rPr>
+          <w:rFonts w:cs="Times New Roman"/>
+        </w:rPr>
+        <w:t>., 2020)</w:t>
+      </w:r>
+      <w:r>
+        <w:rPr>
+          <w:noProof/>
+          <w:lang w:val="en-ID"/>
+        </w:rPr>
+        <w:fldChar w:fldCharType="end"/>
+      </w:r>
+      <w:r>
+        <w:rPr>
+          <w:noProof/>
+          <w:lang w:val="en-ID"/>
+        </w:rPr>
+        <w:t>.</w:t>
+      </w:r>
+    </w:p>
+    <w:p>
+      <w:pPr>
+        <w:ind w:left="147" w:right="142" w:firstLine="420"/>
+        <w:jc w:val="both"/>
+        <w:rPr>
+          <w:noProof/>
+          <w:lang w:val="en-ID"/>
+        </w:rPr>
+      </w:pPr>
+      <w:r>
+        <w:rPr>
+          <w:noProof/>
+          <w:lang w:val="en-ID"/>
+        </w:rPr>
+        <w:t>Kemajuan di bidang NLP dalam beberapa tahun terakhir telah berhasil memberikan angin segar di tengah meledaknya jumlah publikasi literatur ilmiah.</w:t>
+      </w:r>
+      <w:r>
+        <w:rPr>
+          <w:noProof/>
+          <w:lang w:val="en-ID"/>
+        </w:rPr>
+        <w:t xml:space="preserve"> Dari beberapa tahun ke belakang, model NLP yang didasarkan oleh Transformer, terutama BERT (Bidirectional Encoder Representation from Transformer), telah menunjukkan kinerja yang sangat baik dalam pemrosesan bahasa </w:t>
+      </w:r>
+      <w:r>
+        <w:rPr>
+          <w:noProof/>
+          <w:lang w:val="en-ID"/>
+        </w:rPr>
+        <w:fldChar w:fldCharType="begin"/>
+      </w:r>
+      <w:r>
+        <w:rPr>
+          <w:noProof/>
+          <w:lang w:val="en-ID"/>
+        </w:rPr>
+        <w:instrText xml:space="preserve"> ADDIN ZOTERO_ITEM CSL_CITATION {"citationID":"FXpMmQxE","properties":{"formattedCitation":"(Ramadhan &amp; Siswoyo, 2024)","plainCitation":"(Ramadhan &amp; Siswoyo, 2024)","noteIndex":0},"citationItems":[{"id":66,"uris":["http://zotero.org/users/local/z1Fhum2z/items/3BDN7LML"],"itemData":{"id":66,"type":"article-journal","abstract":"This Systematic Literature Review (SLR) analyzes the use of the BERT (Bidirectional Encoder Representations from Transformers) model for sentiment analysis of game reviews. The research identifies methods of implementing BERT, evaluates its effectiveness compared to other models, and explores challenges and opportunities in this context. Results show that BERT consistently outperforms traditional models, with an average accuracy improvement of 3-7%. BERT architecture variations, adiptive fine-tuning techniques, and preprocessing specific to game languages proved effective. Practical applications include game sales prediction and identification of preferred features. Key challenges include high computational requirements and handling gamespecific context. Future research directions include domain-specific model development, multi-modal integration, and improved interpretability. This SLR provides a foundation for further research in the use of advanced language models for sentiment analysis of game reviews.","language":"id","source":"Zotero","title":"Mengenal Model BERT dan Implementasinya untuk Analisis Sentimen Ulasan Game","author":[{"family":"Ramadhan","given":"M Fadhilatur"},{"family":"Siswoyo","given":"Bambang"}],"issued":{"date-parts":[["2024"]]}}}],"schema":"https://github.com/citation-style-language/schema/raw/master/csl-citation.json"} </w:instrText>
+      </w:r>
+      <w:r>
+        <w:rPr>
+          <w:noProof/>
+          <w:lang w:val="en-ID"/>
+        </w:rPr>
+        <w:fldChar w:fldCharType="separate"/>
+      </w:r>
+      <w:r>
+        <w:rPr>
+          <w:rFonts w:cs="Times New Roman"/>
+        </w:rPr>
         <w:t>(</w:t>
       </w:r>
       <w:proofErr w:type="spellStart"/>
@@ -828,14 +1047,28 @@
         <w:rPr>
           <w:rFonts w:cs="Times New Roman"/>
         </w:rPr>
-        <w:t>Shaveta</w:t>
-      </w:r>
-      <w:proofErr w:type="spellEnd"/>
-      <w:r>
-        <w:rPr>
-          <w:rFonts w:cs="Times New Roman"/>
-        </w:rPr>
-        <w:t>, 2023)</w:t>
+        <w:t>Ramadhan</w:t>
+      </w:r>
+      <w:proofErr w:type="spellEnd"/>
+      <w:r>
+        <w:rPr>
+          <w:rFonts w:cs="Times New Roman"/>
+        </w:rPr>
+        <w:t xml:space="preserve"> &amp; </w:t>
+      </w:r>
+      <w:proofErr w:type="spellStart"/>
+      <w:r>
+        <w:rPr>
+          <w:rFonts w:cs="Times New Roman"/>
+        </w:rPr>
+        <w:t>Siswoyo</w:t>
+      </w:r>
+      <w:proofErr w:type="spellEnd"/>
+      <w:r>
+        <w:rPr>
+          <w:rFonts w:cs="Times New Roman"/>
+        </w:rPr>
+        <w:t>, 2024)</w:t>
       </w:r>
       <w:r>
         <w:rPr>
@@ -849,7 +1082,104 @@
           <w:noProof/>
           <w:lang w:val="en-ID"/>
         </w:rPr>
-        <w:t xml:space="preserve">. Pada pengembangan model ML, terdapat 3 jenis pengembangan yang umum digunakan, pengembangan dengan data yang sudah memiliki label (Supervised Learning), pengembangan dengan data tanpa label (Unsupervised Learning), dan juga gabungan dari kedua jenis pengembangan tersebut (Reinforcement Learning). </w:t>
+        <w:t xml:space="preserve">. </w:t>
+      </w:r>
+      <w:r>
+        <w:rPr>
+          <w:noProof/>
+          <w:lang w:val="en-ID"/>
+        </w:rPr>
+        <w:t>BERT merupakan sebu</w:t>
+      </w:r>
+      <w:r>
+        <w:rPr>
+          <w:noProof/>
+          <w:lang w:val="en-ID"/>
+        </w:rPr>
+        <w:t xml:space="preserve">ah model </w:t>
+      </w:r>
+      <w:r>
+        <w:rPr>
+          <w:noProof/>
+          <w:lang w:val="en-ID"/>
+        </w:rPr>
+        <w:t>berbasis NLP</w:t>
+      </w:r>
+      <w:r>
+        <w:rPr>
+          <w:noProof/>
+          <w:lang w:val="en-ID"/>
+        </w:rPr>
+        <w:t xml:space="preserve"> pra-latih </w:t>
+      </w:r>
+      <w:r>
+        <w:rPr>
+          <w:noProof/>
+          <w:lang w:val="en-ID"/>
+        </w:rPr>
+        <w:t xml:space="preserve">yang memungkinkan untuk melakukan kontekstualisasi </w:t>
+      </w:r>
+      <w:r>
+        <w:rPr>
+          <w:noProof/>
+          <w:lang w:val="en-ID"/>
+        </w:rPr>
+        <w:t xml:space="preserve">representasi kata </w:t>
+      </w:r>
+      <w:r>
+        <w:rPr>
+          <w:noProof/>
+          <w:lang w:val="en-ID"/>
+        </w:rPr>
+        <w:fldChar w:fldCharType="begin"/>
+      </w:r>
+      <w:r>
+        <w:rPr>
+          <w:noProof/>
+          <w:lang w:val="en-ID"/>
+        </w:rPr>
+        <w:instrText xml:space="preserve"> ADDIN ZOTERO_ITEM CSL_CITATION {"citationID":"wWgw9alM","properties":{"formattedCitation":"(Lee dkk., 2020)","plainCitation":"(Lee dkk., 2020)","noteIndex":0},"citationItems":[{"id":22,"uris":["http://zotero.org/users/local/z1Fhum2z/items/58TKKQQ5"],"itemData":{"id":22,"type":"article-journal","abstract":"Motivation: Biomedical text mining is becoming increasingly important as the number of biomedical documents rapidly grows. With the progress in natural language processing (NLP), extracting valuable information from biomedical literature has gained popularity among researchers, and deep learning has boosted the development of effective biomedical text mining models. However, directly applying the advancements in NLP to biomedical text mining often yields unsatisfactory results due to a word distribution shift from general domain corpora to biomedical corpora. In this article, we investigate how the recently introduced pre-trained language model BERT can be adapted for biomedical corpora.","container-title":"Bioinformatics","DOI":"10.1093/bioinformatics/btz682","ISSN":"1367-4803, 1367-4811","issue":"4","language":"en","license":"http://creativecommons.org/licenses/by/4.0/","page":"1234-1240","source":"DOI.org (Crossref)","title":"BioBERT: a pre-trained biomedical language representation model for biomedical text mining","title-short":"BioBERT","volume":"36","author":[{"family":"Lee","given":"Jinhyuk"},{"family":"Yoon","given":"Wonjin"},{"family":"Kim","given":"Sungdong"},{"family":"Kim","given":"Donghyeon"},{"family":"Kim","given":"Sunkyu"},{"family":"So","given":"Chan Ho"},{"family":"Kang","given":"Jaewoo"}],"editor":[{"family":"Wren","given":"Jonathan"}],"issued":{"date-parts":[["2020",2,15]]}}}],"schema":"https://github.com/citation-style-language/schema/raw/master/csl-citation.json"} </w:instrText>
+      </w:r>
+      <w:r>
+        <w:rPr>
+          <w:noProof/>
+          <w:lang w:val="en-ID"/>
+        </w:rPr>
+        <w:fldChar w:fldCharType="separate"/>
+      </w:r>
+      <w:r>
+        <w:rPr>
+          <w:rFonts w:cs="Times New Roman"/>
+        </w:rPr>
+        <w:t xml:space="preserve">(Lee </w:t>
+      </w:r>
+      <w:proofErr w:type="spellStart"/>
+      <w:r>
+        <w:rPr>
+          <w:rFonts w:cs="Times New Roman"/>
+        </w:rPr>
+        <w:t>dkk</w:t>
+      </w:r>
+      <w:proofErr w:type="spellEnd"/>
+      <w:r>
+        <w:rPr>
+          <w:rFonts w:cs="Times New Roman"/>
+        </w:rPr>
+        <w:t>., 2020)</w:t>
+      </w:r>
+      <w:r>
+        <w:rPr>
+          <w:noProof/>
+          <w:lang w:val="en-ID"/>
+        </w:rPr>
+        <w:fldChar w:fldCharType="end"/>
+      </w:r>
+      <w:r>
+        <w:rPr>
+          <w:noProof/>
+          <w:lang w:val="en-ID"/>
+        </w:rPr>
+        <w:t xml:space="preserve">. </w:t>
       </w:r>
       <w:bookmarkStart w:id="0" w:name="_GoBack"/>
       <w:bookmarkEnd w:id="0"/>
@@ -872,6 +1202,7 @@
           <w:noProof/>
           <w:lang w:val="id-ID"/>
         </w:rPr>
+        <w:lastRenderedPageBreak/>
         <w:t>Rumusan Masalah</w:t>
       </w:r>
     </w:p>
@@ -1639,23 +1970,55 @@
           <w:rFonts w:cs="Times New Roman"/>
           <w:szCs w:val="24"/>
         </w:rPr>
-        <w:t xml:space="preserve">Lestari, E. G. (2021). </w:t>
-      </w:r>
-      <w:r>
-        <w:rPr>
-          <w:rFonts w:cs="Times New Roman"/>
-          <w:i/>
-          <w:iCs/>
-          <w:szCs w:val="24"/>
-        </w:rPr>
-        <w:t>APLIKASI INDUKSI MUTASI UNTUK PEMULIAAN TANAMAN HIAS</w:t>
-      </w:r>
-      <w:r>
-        <w:rPr>
-          <w:rFonts w:cs="Times New Roman"/>
-          <w:szCs w:val="24"/>
-        </w:rPr>
-        <w:t>.</w:t>
+        <w:t xml:space="preserve">Lee, J., Yoon, W., Kim, S., Kim, D., Kim, S., So, C. H., &amp; Kang, J. (2020). </w:t>
+      </w:r>
+      <w:proofErr w:type="spellStart"/>
+      <w:r>
+        <w:rPr>
+          <w:rFonts w:cs="Times New Roman"/>
+          <w:szCs w:val="24"/>
+        </w:rPr>
+        <w:t>BioBERT</w:t>
+      </w:r>
+      <w:proofErr w:type="spellEnd"/>
+      <w:r>
+        <w:rPr>
+          <w:rFonts w:cs="Times New Roman"/>
+          <w:szCs w:val="24"/>
+        </w:rPr>
+        <w:t xml:space="preserve">: A pre-trained biomedical language representation model for biomedical text mining. </w:t>
+      </w:r>
+      <w:r>
+        <w:rPr>
+          <w:rFonts w:cs="Times New Roman"/>
+          <w:i/>
+          <w:iCs/>
+          <w:szCs w:val="24"/>
+        </w:rPr>
+        <w:t>Bioinformatics</w:t>
+      </w:r>
+      <w:r>
+        <w:rPr>
+          <w:rFonts w:cs="Times New Roman"/>
+          <w:szCs w:val="24"/>
+        </w:rPr>
+        <w:t xml:space="preserve">, </w:t>
+      </w:r>
+      <w:r>
+        <w:rPr>
+          <w:rFonts w:cs="Times New Roman"/>
+          <w:i/>
+          <w:iCs/>
+          <w:szCs w:val="24"/>
+        </w:rPr>
+        <w:t>36</w:t>
+      </w:r>
+      <w:r>
+        <w:rPr>
+          <w:rFonts w:cs="Times New Roman"/>
+          <w:szCs w:val="24"/>
+        </w:rPr>
+        <w:t>(4), 1234–1240. https://doi.org/10.1093/bioinformatics/btz682</w:t>
       </w:r>
     </w:p>
     <w:p>
@@ -1666,247 +2029,28 @@
           <w:szCs w:val="24"/>
         </w:rPr>
       </w:pPr>
-      <w:proofErr w:type="spellStart"/>
-      <w:r>
-        <w:rPr>
-          <w:rFonts w:cs="Times New Roman"/>
-          <w:szCs w:val="24"/>
-        </w:rPr>
-        <w:t>Putri</w:t>
-      </w:r>
-      <w:proofErr w:type="spellEnd"/>
-      <w:r>
-        <w:rPr>
-          <w:rFonts w:cs="Times New Roman"/>
-          <w:szCs w:val="24"/>
-        </w:rPr>
-        <w:t xml:space="preserve">, E. E., </w:t>
-      </w:r>
-      <w:proofErr w:type="spellStart"/>
-      <w:r>
-        <w:rPr>
-          <w:rFonts w:cs="Times New Roman"/>
-          <w:szCs w:val="24"/>
-        </w:rPr>
-        <w:t>Pasangka</w:t>
-      </w:r>
-      <w:proofErr w:type="spellEnd"/>
-      <w:r>
-        <w:rPr>
-          <w:rFonts w:cs="Times New Roman"/>
-          <w:szCs w:val="24"/>
-        </w:rPr>
-        <w:t xml:space="preserve">, B., &amp; </w:t>
-      </w:r>
-      <w:proofErr w:type="spellStart"/>
-      <w:r>
-        <w:rPr>
-          <w:rFonts w:cs="Times New Roman"/>
-          <w:szCs w:val="24"/>
-        </w:rPr>
-        <w:t>Louk</w:t>
-      </w:r>
-      <w:proofErr w:type="spellEnd"/>
-      <w:r>
-        <w:rPr>
-          <w:rFonts w:cs="Times New Roman"/>
-          <w:szCs w:val="24"/>
-        </w:rPr>
-        <w:t xml:space="preserve">, A. C. (2024). </w:t>
-      </w:r>
-      <w:proofErr w:type="spellStart"/>
-      <w:r>
-        <w:rPr>
-          <w:rFonts w:cs="Times New Roman"/>
-          <w:i/>
-          <w:iCs/>
-          <w:szCs w:val="24"/>
-        </w:rPr>
-        <w:t>Pemuliaan</w:t>
-      </w:r>
-      <w:proofErr w:type="spellEnd"/>
-      <w:r>
-        <w:rPr>
-          <w:rFonts w:cs="Times New Roman"/>
-          <w:i/>
-          <w:iCs/>
-          <w:szCs w:val="24"/>
-        </w:rPr>
-        <w:t xml:space="preserve"> </w:t>
-      </w:r>
-      <w:proofErr w:type="spellStart"/>
-      <w:r>
-        <w:rPr>
-          <w:rFonts w:cs="Times New Roman"/>
-          <w:i/>
-          <w:iCs/>
-          <w:szCs w:val="24"/>
-        </w:rPr>
-        <w:t>Tanaman</w:t>
-      </w:r>
-      <w:proofErr w:type="spellEnd"/>
-      <w:r>
-        <w:rPr>
-          <w:rFonts w:cs="Times New Roman"/>
-          <w:i/>
-          <w:iCs/>
-          <w:szCs w:val="24"/>
-        </w:rPr>
-        <w:t xml:space="preserve"> </w:t>
-      </w:r>
-      <w:proofErr w:type="spellStart"/>
-      <w:r>
-        <w:rPr>
-          <w:rFonts w:cs="Times New Roman"/>
-          <w:i/>
-          <w:iCs/>
-          <w:szCs w:val="24"/>
-        </w:rPr>
-        <w:t>Bayam</w:t>
-      </w:r>
-      <w:proofErr w:type="spellEnd"/>
-      <w:r>
-        <w:rPr>
-          <w:rFonts w:cs="Times New Roman"/>
-          <w:i/>
-          <w:iCs/>
-          <w:szCs w:val="24"/>
-        </w:rPr>
-        <w:t xml:space="preserve"> </w:t>
-      </w:r>
-      <w:proofErr w:type="spellStart"/>
-      <w:r>
-        <w:rPr>
-          <w:rFonts w:cs="Times New Roman"/>
-          <w:i/>
-          <w:iCs/>
-          <w:szCs w:val="24"/>
-        </w:rPr>
-        <w:t>Lokal</w:t>
-      </w:r>
-      <w:proofErr w:type="spellEnd"/>
-      <w:r>
-        <w:rPr>
-          <w:rFonts w:cs="Times New Roman"/>
-          <w:i/>
-          <w:iCs/>
-          <w:szCs w:val="24"/>
-        </w:rPr>
-        <w:t xml:space="preserve"> Timor </w:t>
-      </w:r>
-      <w:proofErr w:type="spellStart"/>
-      <w:r>
-        <w:rPr>
-          <w:rFonts w:cs="Times New Roman"/>
-          <w:i/>
-          <w:iCs/>
-          <w:szCs w:val="24"/>
-        </w:rPr>
-        <w:t>dengan</w:t>
-      </w:r>
-      <w:proofErr w:type="spellEnd"/>
-      <w:r>
-        <w:rPr>
-          <w:rFonts w:cs="Times New Roman"/>
-          <w:i/>
-          <w:iCs/>
-          <w:szCs w:val="24"/>
-        </w:rPr>
-        <w:t xml:space="preserve"> </w:t>
-      </w:r>
-      <w:proofErr w:type="spellStart"/>
-      <w:r>
-        <w:rPr>
-          <w:rFonts w:cs="Times New Roman"/>
-          <w:i/>
-          <w:iCs/>
-          <w:szCs w:val="24"/>
-        </w:rPr>
-        <w:t>Metode</w:t>
-      </w:r>
-      <w:proofErr w:type="spellEnd"/>
-      <w:r>
-        <w:rPr>
-          <w:rFonts w:cs="Times New Roman"/>
-          <w:i/>
-          <w:iCs/>
-          <w:szCs w:val="24"/>
-        </w:rPr>
-        <w:t xml:space="preserve"> </w:t>
-      </w:r>
-      <w:proofErr w:type="spellStart"/>
-      <w:r>
-        <w:rPr>
-          <w:rFonts w:cs="Times New Roman"/>
-          <w:i/>
-          <w:iCs/>
-          <w:szCs w:val="24"/>
-        </w:rPr>
-        <w:t>Radiasi</w:t>
-      </w:r>
-      <w:proofErr w:type="spellEnd"/>
-      <w:r>
-        <w:rPr>
-          <w:rFonts w:cs="Times New Roman"/>
-          <w:i/>
-          <w:iCs/>
-          <w:szCs w:val="24"/>
-        </w:rPr>
-        <w:t xml:space="preserve"> </w:t>
-      </w:r>
-      <w:proofErr w:type="spellStart"/>
-      <w:r>
-        <w:rPr>
-          <w:rFonts w:cs="Times New Roman"/>
-          <w:i/>
-          <w:iCs/>
-          <w:szCs w:val="24"/>
-        </w:rPr>
-        <w:t>Multigamma</w:t>
-      </w:r>
-      <w:proofErr w:type="spellEnd"/>
-      <w:r>
-        <w:rPr>
-          <w:rFonts w:cs="Times New Roman"/>
-          <w:i/>
-          <w:iCs/>
-          <w:szCs w:val="24"/>
-        </w:rPr>
-        <w:t xml:space="preserve"> </w:t>
-      </w:r>
-      <w:proofErr w:type="spellStart"/>
-      <w:r>
-        <w:rPr>
-          <w:rFonts w:cs="Times New Roman"/>
-          <w:i/>
-          <w:iCs/>
-          <w:szCs w:val="24"/>
-        </w:rPr>
-        <w:t>Standar</w:t>
-      </w:r>
-      <w:proofErr w:type="spellEnd"/>
-      <w:r>
-        <w:rPr>
-          <w:rFonts w:cs="Times New Roman"/>
-          <w:szCs w:val="24"/>
-        </w:rPr>
-        <w:t xml:space="preserve">. </w:t>
-      </w:r>
-      <w:r>
-        <w:rPr>
-          <w:rFonts w:cs="Times New Roman"/>
-          <w:i/>
-          <w:iCs/>
-          <w:szCs w:val="24"/>
-        </w:rPr>
-        <w:t>4</w:t>
-      </w:r>
-      <w:r>
-        <w:rPr>
-          <w:rFonts w:cs="Times New Roman"/>
-          <w:szCs w:val="24"/>
-        </w:rPr>
-        <w:t>(1).</w:t>
+      <w:r>
+        <w:rPr>
+          <w:rFonts w:cs="Times New Roman"/>
+          <w:szCs w:val="24"/>
+        </w:rPr>
+        <w:t xml:space="preserve">Lestari, E. G. (2021). </w:t>
+      </w:r>
+      <w:r>
+        <w:rPr>
+          <w:rFonts w:cs="Times New Roman"/>
+          <w:i/>
+          <w:iCs/>
+          <w:szCs w:val="24"/>
+        </w:rPr>
+        <w:t>APLIKASI INDUKSI MUTASI UNTUK PEMULIAAN TANAMAN HIAS</w:t>
+      </w:r>
+      <w:r>
+        <w:rPr>
+          <w:rFonts w:cs="Times New Roman"/>
+          <w:szCs w:val="24"/>
+        </w:rPr>
+        <w:t>.</w:t>
       </w:r>
     </w:p>
     <w:p>
@@ -1917,38 +2061,222 @@
           <w:szCs w:val="24"/>
         </w:rPr>
       </w:pPr>
-      <w:r>
-        <w:rPr>
-          <w:rFonts w:cs="Times New Roman"/>
-          <w:szCs w:val="24"/>
-        </w:rPr>
-        <w:t xml:space="preserve">Reddy, M. S., &amp; </w:t>
-      </w:r>
-      <w:proofErr w:type="spellStart"/>
-      <w:r>
-        <w:rPr>
-          <w:rFonts w:cs="Times New Roman"/>
-          <w:szCs w:val="24"/>
-        </w:rPr>
-        <w:t>Pinjari</w:t>
-      </w:r>
-      <w:proofErr w:type="spellEnd"/>
-      <w:r>
-        <w:rPr>
-          <w:rFonts w:cs="Times New Roman"/>
-          <w:szCs w:val="24"/>
-        </w:rPr>
-        <w:t xml:space="preserve">, O. B. (2023). Mutagenesis Approaches in Plants and their Applications. </w:t>
-      </w:r>
-      <w:r>
-        <w:rPr>
-          <w:rFonts w:cs="Times New Roman"/>
-          <w:i/>
-          <w:iCs/>
-          <w:szCs w:val="24"/>
-        </w:rPr>
-        <w:t>Asian Journal of Agriculture and Allied Sciences</w:t>
-      </w:r>
+      <w:proofErr w:type="spellStart"/>
+      <w:r>
+        <w:rPr>
+          <w:rFonts w:cs="Times New Roman"/>
+          <w:szCs w:val="24"/>
+        </w:rPr>
+        <w:t>Ompo</w:t>
+      </w:r>
+      <w:proofErr w:type="spellEnd"/>
+      <w:r>
+        <w:rPr>
+          <w:rFonts w:cs="Times New Roman"/>
+          <w:szCs w:val="24"/>
+        </w:rPr>
+        <w:t xml:space="preserve">, F. A. A., &amp; </w:t>
+      </w:r>
+      <w:proofErr w:type="spellStart"/>
+      <w:r>
+        <w:rPr>
+          <w:rFonts w:cs="Times New Roman"/>
+          <w:szCs w:val="24"/>
+        </w:rPr>
+        <w:t>Pakereng</w:t>
+      </w:r>
+      <w:proofErr w:type="spellEnd"/>
+      <w:r>
+        <w:rPr>
+          <w:rFonts w:cs="Times New Roman"/>
+          <w:szCs w:val="24"/>
+        </w:rPr>
+        <w:t xml:space="preserve">, M. A. I. (2024). </w:t>
+      </w:r>
+      <w:proofErr w:type="spellStart"/>
+      <w:r>
+        <w:rPr>
+          <w:rFonts w:cs="Times New Roman"/>
+          <w:szCs w:val="24"/>
+        </w:rPr>
+        <w:t>Penerapan</w:t>
+      </w:r>
+      <w:proofErr w:type="spellEnd"/>
+      <w:r>
+        <w:rPr>
+          <w:rFonts w:cs="Times New Roman"/>
+          <w:szCs w:val="24"/>
+        </w:rPr>
+        <w:t xml:space="preserve"> Text Mining </w:t>
+      </w:r>
+      <w:proofErr w:type="spellStart"/>
+      <w:r>
+        <w:rPr>
+          <w:rFonts w:cs="Times New Roman"/>
+          <w:szCs w:val="24"/>
+        </w:rPr>
+        <w:t>Untuk</w:t>
+      </w:r>
+      <w:proofErr w:type="spellEnd"/>
+      <w:r>
+        <w:rPr>
+          <w:rFonts w:cs="Times New Roman"/>
+          <w:szCs w:val="24"/>
+        </w:rPr>
+        <w:t xml:space="preserve"> Advertising </w:t>
+      </w:r>
+      <w:proofErr w:type="spellStart"/>
+      <w:r>
+        <w:rPr>
+          <w:rFonts w:cs="Times New Roman"/>
+          <w:szCs w:val="24"/>
+        </w:rPr>
+        <w:t>Pada</w:t>
+      </w:r>
+      <w:proofErr w:type="spellEnd"/>
+      <w:r>
+        <w:rPr>
+          <w:rFonts w:cs="Times New Roman"/>
+          <w:szCs w:val="24"/>
+        </w:rPr>
+        <w:t xml:space="preserve"> Data Tweets </w:t>
+      </w:r>
+      <w:proofErr w:type="spellStart"/>
+      <w:r>
+        <w:rPr>
+          <w:rFonts w:cs="Times New Roman"/>
+          <w:szCs w:val="24"/>
+        </w:rPr>
+        <w:t>Zalora</w:t>
+      </w:r>
+      <w:proofErr w:type="spellEnd"/>
+      <w:r>
+        <w:rPr>
+          <w:rFonts w:cs="Times New Roman"/>
+          <w:szCs w:val="24"/>
+        </w:rPr>
+        <w:t xml:space="preserve"> Indonesia </w:t>
+      </w:r>
+      <w:proofErr w:type="spellStart"/>
+      <w:r>
+        <w:rPr>
+          <w:rFonts w:cs="Times New Roman"/>
+          <w:szCs w:val="24"/>
+        </w:rPr>
+        <w:t>Dengan</w:t>
+      </w:r>
+      <w:proofErr w:type="spellEnd"/>
+      <w:r>
+        <w:rPr>
+          <w:rFonts w:cs="Times New Roman"/>
+          <w:szCs w:val="24"/>
+        </w:rPr>
+        <w:t xml:space="preserve"> </w:t>
+      </w:r>
+      <w:proofErr w:type="spellStart"/>
+      <w:r>
+        <w:rPr>
+          <w:rFonts w:cs="Times New Roman"/>
+          <w:szCs w:val="24"/>
+        </w:rPr>
+        <w:t>Menggunakan</w:t>
+      </w:r>
+      <w:proofErr w:type="spellEnd"/>
+      <w:r>
+        <w:rPr>
+          <w:rFonts w:cs="Times New Roman"/>
+          <w:szCs w:val="24"/>
+        </w:rPr>
+        <w:t xml:space="preserve"> </w:t>
+      </w:r>
+      <w:proofErr w:type="spellStart"/>
+      <w:r>
+        <w:rPr>
+          <w:rFonts w:cs="Times New Roman"/>
+          <w:szCs w:val="24"/>
+        </w:rPr>
+        <w:t>Metode</w:t>
+      </w:r>
+      <w:proofErr w:type="spellEnd"/>
+      <w:r>
+        <w:rPr>
+          <w:rFonts w:cs="Times New Roman"/>
+          <w:szCs w:val="24"/>
+        </w:rPr>
+        <w:t xml:space="preserve"> K-Means Clustering. </w:t>
+      </w:r>
+      <w:proofErr w:type="spellStart"/>
+      <w:r>
+        <w:rPr>
+          <w:rFonts w:cs="Times New Roman"/>
+          <w:i/>
+          <w:iCs/>
+          <w:szCs w:val="24"/>
+        </w:rPr>
+        <w:lastRenderedPageBreak/>
+        <w:t>Progresif</w:t>
+      </w:r>
+      <w:proofErr w:type="spellEnd"/>
+      <w:r>
+        <w:rPr>
+          <w:rFonts w:cs="Times New Roman"/>
+          <w:i/>
+          <w:iCs/>
+          <w:szCs w:val="24"/>
+        </w:rPr>
+        <w:t xml:space="preserve">: </w:t>
+      </w:r>
+      <w:proofErr w:type="spellStart"/>
+      <w:r>
+        <w:rPr>
+          <w:rFonts w:cs="Times New Roman"/>
+          <w:i/>
+          <w:iCs/>
+          <w:szCs w:val="24"/>
+        </w:rPr>
+        <w:t>Jurnal</w:t>
+      </w:r>
+      <w:proofErr w:type="spellEnd"/>
+      <w:r>
+        <w:rPr>
+          <w:rFonts w:cs="Times New Roman"/>
+          <w:i/>
+          <w:iCs/>
+          <w:szCs w:val="24"/>
+        </w:rPr>
+        <w:t xml:space="preserve"> </w:t>
+      </w:r>
+      <w:proofErr w:type="spellStart"/>
+      <w:r>
+        <w:rPr>
+          <w:rFonts w:cs="Times New Roman"/>
+          <w:i/>
+          <w:iCs/>
+          <w:szCs w:val="24"/>
+        </w:rPr>
+        <w:t>Ilmiah</w:t>
+      </w:r>
+      <w:proofErr w:type="spellEnd"/>
+      <w:r>
+        <w:rPr>
+          <w:rFonts w:cs="Times New Roman"/>
+          <w:i/>
+          <w:iCs/>
+          <w:szCs w:val="24"/>
+        </w:rPr>
+        <w:t xml:space="preserve"> </w:t>
+      </w:r>
+      <w:proofErr w:type="spellStart"/>
+      <w:r>
+        <w:rPr>
+          <w:rFonts w:cs="Times New Roman"/>
+          <w:i/>
+          <w:iCs/>
+          <w:szCs w:val="24"/>
+        </w:rPr>
+        <w:t>Komputer</w:t>
+      </w:r>
+      <w:proofErr w:type="spellEnd"/>
       <w:r>
         <w:rPr>
           <w:rFonts w:cs="Times New Roman"/>
@@ -1963,14 +2291,14 @@
           <w:iCs/>
           <w:szCs w:val="24"/>
         </w:rPr>
-        <w:t>6</w:t>
-      </w:r>
-      <w:r>
-        <w:rPr>
-          <w:rFonts w:cs="Times New Roman"/>
-          <w:szCs w:val="24"/>
-        </w:rPr>
-        <w:t>(1), 20–29. https://doi.org/10.56557/ajaas/2023/v6i135</w:t>
+        <w:t>20</w:t>
+      </w:r>
+      <w:r>
+        <w:rPr>
+          <w:rFonts w:cs="Times New Roman"/>
+          <w:szCs w:val="24"/>
+        </w:rPr>
+        <w:t>(1), 314. https://doi.org/10.35889/progresif.v20i1.1576</w:t>
       </w:r>
     </w:p>
     <w:p>
@@ -1987,7 +2315,509 @@
           <w:rFonts w:cs="Times New Roman"/>
           <w:szCs w:val="24"/>
         </w:rPr>
-        <w:lastRenderedPageBreak/>
+        <w:t>Putri</w:t>
+      </w:r>
+      <w:proofErr w:type="spellEnd"/>
+      <w:r>
+        <w:rPr>
+          <w:rFonts w:cs="Times New Roman"/>
+          <w:szCs w:val="24"/>
+        </w:rPr>
+        <w:t xml:space="preserve">, E. E., </w:t>
+      </w:r>
+      <w:proofErr w:type="spellStart"/>
+      <w:r>
+        <w:rPr>
+          <w:rFonts w:cs="Times New Roman"/>
+          <w:szCs w:val="24"/>
+        </w:rPr>
+        <w:t>Pasangka</w:t>
+      </w:r>
+      <w:proofErr w:type="spellEnd"/>
+      <w:r>
+        <w:rPr>
+          <w:rFonts w:cs="Times New Roman"/>
+          <w:szCs w:val="24"/>
+        </w:rPr>
+        <w:t xml:space="preserve">, B., &amp; </w:t>
+      </w:r>
+      <w:proofErr w:type="spellStart"/>
+      <w:r>
+        <w:rPr>
+          <w:rFonts w:cs="Times New Roman"/>
+          <w:szCs w:val="24"/>
+        </w:rPr>
+        <w:t>Louk</w:t>
+      </w:r>
+      <w:proofErr w:type="spellEnd"/>
+      <w:r>
+        <w:rPr>
+          <w:rFonts w:cs="Times New Roman"/>
+          <w:szCs w:val="24"/>
+        </w:rPr>
+        <w:t xml:space="preserve">, A. C. (2024). </w:t>
+      </w:r>
+      <w:proofErr w:type="spellStart"/>
+      <w:r>
+        <w:rPr>
+          <w:rFonts w:cs="Times New Roman"/>
+          <w:i/>
+          <w:iCs/>
+          <w:szCs w:val="24"/>
+        </w:rPr>
+        <w:t>Pemuliaan</w:t>
+      </w:r>
+      <w:proofErr w:type="spellEnd"/>
+      <w:r>
+        <w:rPr>
+          <w:rFonts w:cs="Times New Roman"/>
+          <w:i/>
+          <w:iCs/>
+          <w:szCs w:val="24"/>
+        </w:rPr>
+        <w:t xml:space="preserve"> </w:t>
+      </w:r>
+      <w:proofErr w:type="spellStart"/>
+      <w:r>
+        <w:rPr>
+          <w:rFonts w:cs="Times New Roman"/>
+          <w:i/>
+          <w:iCs/>
+          <w:szCs w:val="24"/>
+        </w:rPr>
+        <w:t>Tanaman</w:t>
+      </w:r>
+      <w:proofErr w:type="spellEnd"/>
+      <w:r>
+        <w:rPr>
+          <w:rFonts w:cs="Times New Roman"/>
+          <w:i/>
+          <w:iCs/>
+          <w:szCs w:val="24"/>
+        </w:rPr>
+        <w:t xml:space="preserve"> </w:t>
+      </w:r>
+      <w:proofErr w:type="spellStart"/>
+      <w:r>
+        <w:rPr>
+          <w:rFonts w:cs="Times New Roman"/>
+          <w:i/>
+          <w:iCs/>
+          <w:szCs w:val="24"/>
+        </w:rPr>
+        <w:t>Bayam</w:t>
+      </w:r>
+      <w:proofErr w:type="spellEnd"/>
+      <w:r>
+        <w:rPr>
+          <w:rFonts w:cs="Times New Roman"/>
+          <w:i/>
+          <w:iCs/>
+          <w:szCs w:val="24"/>
+        </w:rPr>
+        <w:t xml:space="preserve"> </w:t>
+      </w:r>
+      <w:proofErr w:type="spellStart"/>
+      <w:r>
+        <w:rPr>
+          <w:rFonts w:cs="Times New Roman"/>
+          <w:i/>
+          <w:iCs/>
+          <w:szCs w:val="24"/>
+        </w:rPr>
+        <w:t>Lokal</w:t>
+      </w:r>
+      <w:proofErr w:type="spellEnd"/>
+      <w:r>
+        <w:rPr>
+          <w:rFonts w:cs="Times New Roman"/>
+          <w:i/>
+          <w:iCs/>
+          <w:szCs w:val="24"/>
+        </w:rPr>
+        <w:t xml:space="preserve"> Timor </w:t>
+      </w:r>
+      <w:proofErr w:type="spellStart"/>
+      <w:r>
+        <w:rPr>
+          <w:rFonts w:cs="Times New Roman"/>
+          <w:i/>
+          <w:iCs/>
+          <w:szCs w:val="24"/>
+        </w:rPr>
+        <w:t>dengan</w:t>
+      </w:r>
+      <w:proofErr w:type="spellEnd"/>
+      <w:r>
+        <w:rPr>
+          <w:rFonts w:cs="Times New Roman"/>
+          <w:i/>
+          <w:iCs/>
+          <w:szCs w:val="24"/>
+        </w:rPr>
+        <w:t xml:space="preserve"> </w:t>
+      </w:r>
+      <w:proofErr w:type="spellStart"/>
+      <w:r>
+        <w:rPr>
+          <w:rFonts w:cs="Times New Roman"/>
+          <w:i/>
+          <w:iCs/>
+          <w:szCs w:val="24"/>
+        </w:rPr>
+        <w:t>Metode</w:t>
+      </w:r>
+      <w:proofErr w:type="spellEnd"/>
+      <w:r>
+        <w:rPr>
+          <w:rFonts w:cs="Times New Roman"/>
+          <w:i/>
+          <w:iCs/>
+          <w:szCs w:val="24"/>
+        </w:rPr>
+        <w:t xml:space="preserve"> </w:t>
+      </w:r>
+      <w:proofErr w:type="spellStart"/>
+      <w:r>
+        <w:rPr>
+          <w:rFonts w:cs="Times New Roman"/>
+          <w:i/>
+          <w:iCs/>
+          <w:szCs w:val="24"/>
+        </w:rPr>
+        <w:t>Radiasi</w:t>
+      </w:r>
+      <w:proofErr w:type="spellEnd"/>
+      <w:r>
+        <w:rPr>
+          <w:rFonts w:cs="Times New Roman"/>
+          <w:i/>
+          <w:iCs/>
+          <w:szCs w:val="24"/>
+        </w:rPr>
+        <w:t xml:space="preserve"> </w:t>
+      </w:r>
+      <w:proofErr w:type="spellStart"/>
+      <w:r>
+        <w:rPr>
+          <w:rFonts w:cs="Times New Roman"/>
+          <w:i/>
+          <w:iCs/>
+          <w:szCs w:val="24"/>
+        </w:rPr>
+        <w:t>Multigamma</w:t>
+      </w:r>
+      <w:proofErr w:type="spellEnd"/>
+      <w:r>
+        <w:rPr>
+          <w:rFonts w:cs="Times New Roman"/>
+          <w:i/>
+          <w:iCs/>
+          <w:szCs w:val="24"/>
+        </w:rPr>
+        <w:t xml:space="preserve"> </w:t>
+      </w:r>
+      <w:proofErr w:type="spellStart"/>
+      <w:r>
+        <w:rPr>
+          <w:rFonts w:cs="Times New Roman"/>
+          <w:i/>
+          <w:iCs/>
+          <w:szCs w:val="24"/>
+        </w:rPr>
+        <w:t>Standar</w:t>
+      </w:r>
+      <w:proofErr w:type="spellEnd"/>
+      <w:r>
+        <w:rPr>
+          <w:rFonts w:cs="Times New Roman"/>
+          <w:szCs w:val="24"/>
+        </w:rPr>
+        <w:t xml:space="preserve">. </w:t>
+      </w:r>
+      <w:r>
+        <w:rPr>
+          <w:rFonts w:cs="Times New Roman"/>
+          <w:i/>
+          <w:iCs/>
+          <w:szCs w:val="24"/>
+        </w:rPr>
+        <w:t>4</w:t>
+      </w:r>
+      <w:r>
+        <w:rPr>
+          <w:rFonts w:cs="Times New Roman"/>
+          <w:szCs w:val="24"/>
+        </w:rPr>
+        <w:t>(1).</w:t>
+      </w:r>
+    </w:p>
+    <w:p>
+      <w:pPr>
+        <w:pStyle w:val="Bibliography"/>
+        <w:rPr>
+          <w:rFonts w:cs="Times New Roman"/>
+          <w:szCs w:val="24"/>
+        </w:rPr>
+      </w:pPr>
+      <w:proofErr w:type="spellStart"/>
+      <w:r>
+        <w:rPr>
+          <w:rFonts w:cs="Times New Roman"/>
+          <w:szCs w:val="24"/>
+        </w:rPr>
+        <w:t>Ramadhan</w:t>
+      </w:r>
+      <w:proofErr w:type="spellEnd"/>
+      <w:r>
+        <w:rPr>
+          <w:rFonts w:cs="Times New Roman"/>
+          <w:szCs w:val="24"/>
+        </w:rPr>
+        <w:t xml:space="preserve">, M. F., &amp; </w:t>
+      </w:r>
+      <w:proofErr w:type="spellStart"/>
+      <w:r>
+        <w:rPr>
+          <w:rFonts w:cs="Times New Roman"/>
+          <w:szCs w:val="24"/>
+        </w:rPr>
+        <w:t>Siswoyo</w:t>
+      </w:r>
+      <w:proofErr w:type="spellEnd"/>
+      <w:r>
+        <w:rPr>
+          <w:rFonts w:cs="Times New Roman"/>
+          <w:szCs w:val="24"/>
+        </w:rPr>
+        <w:t xml:space="preserve">, B. (2024). </w:t>
+      </w:r>
+      <w:proofErr w:type="spellStart"/>
+      <w:r>
+        <w:rPr>
+          <w:rFonts w:cs="Times New Roman"/>
+          <w:i/>
+          <w:iCs/>
+          <w:szCs w:val="24"/>
+        </w:rPr>
+        <w:t>Mengenal</w:t>
+      </w:r>
+      <w:proofErr w:type="spellEnd"/>
+      <w:r>
+        <w:rPr>
+          <w:rFonts w:cs="Times New Roman"/>
+          <w:i/>
+          <w:iCs/>
+          <w:szCs w:val="24"/>
+        </w:rPr>
+        <w:t xml:space="preserve"> Model BERT </w:t>
+      </w:r>
+      <w:proofErr w:type="spellStart"/>
+      <w:r>
+        <w:rPr>
+          <w:rFonts w:cs="Times New Roman"/>
+          <w:i/>
+          <w:iCs/>
+          <w:szCs w:val="24"/>
+        </w:rPr>
+        <w:t>dan</w:t>
+      </w:r>
+      <w:proofErr w:type="spellEnd"/>
+      <w:r>
+        <w:rPr>
+          <w:rFonts w:cs="Times New Roman"/>
+          <w:i/>
+          <w:iCs/>
+          <w:szCs w:val="24"/>
+        </w:rPr>
+        <w:t xml:space="preserve"> </w:t>
+      </w:r>
+      <w:proofErr w:type="spellStart"/>
+      <w:r>
+        <w:rPr>
+          <w:rFonts w:cs="Times New Roman"/>
+          <w:i/>
+          <w:iCs/>
+          <w:szCs w:val="24"/>
+        </w:rPr>
+        <w:t>Implementasinya</w:t>
+      </w:r>
+      <w:proofErr w:type="spellEnd"/>
+      <w:r>
+        <w:rPr>
+          <w:rFonts w:cs="Times New Roman"/>
+          <w:i/>
+          <w:iCs/>
+          <w:szCs w:val="24"/>
+        </w:rPr>
+        <w:t xml:space="preserve"> </w:t>
+      </w:r>
+      <w:proofErr w:type="spellStart"/>
+      <w:r>
+        <w:rPr>
+          <w:rFonts w:cs="Times New Roman"/>
+          <w:i/>
+          <w:iCs/>
+          <w:szCs w:val="24"/>
+        </w:rPr>
+        <w:t>untuk</w:t>
+      </w:r>
+      <w:proofErr w:type="spellEnd"/>
+      <w:r>
+        <w:rPr>
+          <w:rFonts w:cs="Times New Roman"/>
+          <w:i/>
+          <w:iCs/>
+          <w:szCs w:val="24"/>
+        </w:rPr>
+        <w:t xml:space="preserve"> </w:t>
+      </w:r>
+      <w:proofErr w:type="spellStart"/>
+      <w:r>
+        <w:rPr>
+          <w:rFonts w:cs="Times New Roman"/>
+          <w:i/>
+          <w:iCs/>
+          <w:szCs w:val="24"/>
+        </w:rPr>
+        <w:t>Analisis</w:t>
+      </w:r>
+      <w:proofErr w:type="spellEnd"/>
+      <w:r>
+        <w:rPr>
+          <w:rFonts w:cs="Times New Roman"/>
+          <w:i/>
+          <w:iCs/>
+          <w:szCs w:val="24"/>
+        </w:rPr>
+        <w:t xml:space="preserve"> </w:t>
+      </w:r>
+      <w:proofErr w:type="spellStart"/>
+      <w:r>
+        <w:rPr>
+          <w:rFonts w:cs="Times New Roman"/>
+          <w:i/>
+          <w:iCs/>
+          <w:szCs w:val="24"/>
+        </w:rPr>
+        <w:t>Sentimen</w:t>
+      </w:r>
+      <w:proofErr w:type="spellEnd"/>
+      <w:r>
+        <w:rPr>
+          <w:rFonts w:cs="Times New Roman"/>
+          <w:i/>
+          <w:iCs/>
+          <w:szCs w:val="24"/>
+        </w:rPr>
+        <w:t xml:space="preserve"> </w:t>
+      </w:r>
+      <w:proofErr w:type="spellStart"/>
+      <w:r>
+        <w:rPr>
+          <w:rFonts w:cs="Times New Roman"/>
+          <w:i/>
+          <w:iCs/>
+          <w:szCs w:val="24"/>
+        </w:rPr>
+        <w:t>Ulasan</w:t>
+      </w:r>
+      <w:proofErr w:type="spellEnd"/>
+      <w:r>
+        <w:rPr>
+          <w:rFonts w:cs="Times New Roman"/>
+          <w:i/>
+          <w:iCs/>
+          <w:szCs w:val="24"/>
+        </w:rPr>
+        <w:t xml:space="preserve"> Game</w:t>
+      </w:r>
+      <w:r>
+        <w:rPr>
+          <w:rFonts w:cs="Times New Roman"/>
+          <w:szCs w:val="24"/>
+        </w:rPr>
+        <w:t>.</w:t>
+      </w:r>
+    </w:p>
+    <w:p>
+      <w:pPr>
+        <w:pStyle w:val="Bibliography"/>
+        <w:rPr>
+          <w:rFonts w:cs="Times New Roman"/>
+          <w:szCs w:val="24"/>
+        </w:rPr>
+      </w:pPr>
+      <w:r>
+        <w:rPr>
+          <w:rFonts w:cs="Times New Roman"/>
+          <w:szCs w:val="24"/>
+        </w:rPr>
+        <w:t xml:space="preserve">Reddy, M. S., &amp; </w:t>
+      </w:r>
+      <w:proofErr w:type="spellStart"/>
+      <w:r>
+        <w:rPr>
+          <w:rFonts w:cs="Times New Roman"/>
+          <w:szCs w:val="24"/>
+        </w:rPr>
+        <w:t>Pinjari</w:t>
+      </w:r>
+      <w:proofErr w:type="spellEnd"/>
+      <w:r>
+        <w:rPr>
+          <w:rFonts w:cs="Times New Roman"/>
+          <w:szCs w:val="24"/>
+        </w:rPr>
+        <w:t xml:space="preserve">, O. B. (2023). Mutagenesis Approaches in Plants and their Applications. </w:t>
+      </w:r>
+      <w:r>
+        <w:rPr>
+          <w:rFonts w:cs="Times New Roman"/>
+          <w:i/>
+          <w:iCs/>
+          <w:szCs w:val="24"/>
+        </w:rPr>
+        <w:t>Asian Journal of Agriculture and Allied Sciences</w:t>
+      </w:r>
+      <w:r>
+        <w:rPr>
+          <w:rFonts w:cs="Times New Roman"/>
+          <w:szCs w:val="24"/>
+        </w:rPr>
+        <w:t xml:space="preserve">, </w:t>
+      </w:r>
+      <w:r>
+        <w:rPr>
+          <w:rFonts w:cs="Times New Roman"/>
+          <w:i/>
+          <w:iCs/>
+          <w:szCs w:val="24"/>
+        </w:rPr>
+        <w:t>6</w:t>
+      </w:r>
+      <w:r>
+        <w:rPr>
+          <w:rFonts w:cs="Times New Roman"/>
+          <w:szCs w:val="24"/>
+        </w:rPr>
+        <w:t>(1), 20–29. https://doi.org/10.56557/ajaas/2023/v6i135</w:t>
+      </w:r>
+    </w:p>
+    <w:p>
+      <w:pPr>
+        <w:pStyle w:val="Bibliography"/>
+        <w:rPr>
+          <w:rFonts w:cs="Times New Roman"/>
+          <w:szCs w:val="24"/>
+        </w:rPr>
+      </w:pPr>
+      <w:proofErr w:type="spellStart"/>
+      <w:r>
+        <w:rPr>
+          <w:rFonts w:cs="Times New Roman"/>
+          <w:szCs w:val="24"/>
+        </w:rPr>
         <w:t>Shaveta</w:t>
       </w:r>
       <w:proofErr w:type="spellEnd"/>
@@ -3123,7 +3953,7 @@
 </file>
 
 <file path=customXml/itemProps1.xml><?xml version="1.0" encoding="utf-8"?>
-<ds:datastoreItem xmlns:ds="http://schemas.openxmlformats.org/officeDocument/2006/customXml" ds:itemID="{445EC0FF-74C4-429B-8026-C559D4737213}">
+<ds:datastoreItem xmlns:ds="http://schemas.openxmlformats.org/officeDocument/2006/customXml" ds:itemID="{5B7BBD0E-7037-4854-B02E-B4CFD4A8F49B}">
   <ds:schemaRefs>
     <ds:schemaRef ds:uri="http://schemas.openxmlformats.org/officeDocument/2006/bibliography"/>
   </ds:schemaRefs>

</xml_diff>